<commit_message>
docs: larger fonts, time estimates, 1-day MVP plan
</commit_message>
<xml_diff>
--- a/docs/WuLab-FeaturePlan.docx
+++ b/docs/WuLab-FeaturePlan.docx
@@ -11,7 +11,7 @@
         <w:rPr>
           <w:b/>
           <w:color w:val="1A56DB"/>
-          <w:sz w:val="48"/>
+          <w:sz w:val="56"/>
         </w:rPr>
         <w:t>WuLab — สยามมาสเตอร์คอนกรีต</w:t>
       </w:r>
@@ -23,7 +23,7 @@
       <w:r>
         <w:rPr>
           <w:color w:val="555555"/>
-          <w:sz w:val="28"/>
+          <w:sz w:val="36"/>
         </w:rPr>
         <w:t>แผนพัฒนาเว็บไซต์และระบบขาย  |  รายการฟีเจอร์และแผนงาน</w:t>
       </w:r>
@@ -36,22 +36,19 @@
         <w:rPr>
           <w:i/>
           <w:color w:val="888888"/>
-          <w:sz w:val="22"/>
+          <w:sz w:val="26"/>
         </w:rPr>
         <w:t>จัดทำวันที่ 02/05/2026</w:t>
       </w:r>
     </w:p>
     <w:p/>
     <w:p>
-      <w:pPr>
-        <w:spacing w:before="40" w:after="40"/>
-      </w:pPr>
       <w:r>
         <w:rPr>
           <w:color w:val="CCCCCC"/>
-          <w:sz w:val="16"/>
+          <w:sz w:val="18"/>
         </w:rPr>
-        <w:t>───────────────────────────────────────────────────────────────────────────</w:t>
+        <w:t>─────────────────────────────────────────────────────────────────</w:t>
       </w:r>
     </w:p>
     <w:p/>
@@ -63,7 +60,7 @@
         <w:rPr>
           <w:b/>
           <w:color w:val="1A56DB"/>
-          <w:sz w:val="36"/>
+          <w:sz w:val="44"/>
         </w:rPr>
         <w:t>1. ข้อมูลบริษัท</w:t>
       </w:r>
@@ -81,7 +78,7 @@
       <w:tr>
         <w:tc>
           <w:tcPr>
-            <w:tcW w:type="dxa" w:w="2835"/>
+            <w:tcW w:type="dxa" w:w="3118"/>
             <w:shd w:val="clear" w:color="auto" w:fill="1A56DB"/>
           </w:tcPr>
           <w:p>
@@ -92,7 +89,7 @@
               <w:rPr>
                 <w:b/>
                 <w:color w:val="FFFFFF"/>
-                <w:sz w:val="24"/>
+                <w:sz w:val="32"/>
               </w:rPr>
               <w:t>หัวข้อ</w:t>
             </w:r>
@@ -100,7 +97,7 @@
         </w:tc>
         <w:tc>
           <w:tcPr>
-            <w:tcW w:type="dxa" w:w="5953"/>
+            <w:tcW w:type="dxa" w:w="5669"/>
             <w:shd w:val="clear" w:color="auto" w:fill="1A56DB"/>
           </w:tcPr>
           <w:p>
@@ -111,7 +108,7 @@
               <w:rPr>
                 <w:b/>
                 <w:color w:val="FFFFFF"/>
-                <w:sz w:val="24"/>
+                <w:sz w:val="32"/>
               </w:rPr>
               <w:t>รายละเอียด</w:t>
             </w:r>
@@ -121,12 +118,12 @@
       <w:tr>
         <w:tc>
           <w:tcPr>
-            <w:tcW w:type="dxa" w:w="2835"/>
+            <w:tcW w:type="dxa" w:w="3118"/>
           </w:tcPr>
           <w:p>
             <w:r>
               <w:rPr>
-                <w:sz w:val="24"/>
+                <w:sz w:val="32"/>
               </w:rPr>
               <w:t>ชื่อบริษัท</w:t>
             </w:r>
@@ -134,12 +131,12 @@
         </w:tc>
         <w:tc>
           <w:tcPr>
-            <w:tcW w:type="dxa" w:w="5953"/>
+            <w:tcW w:type="dxa" w:w="5669"/>
           </w:tcPr>
           <w:p>
             <w:r>
               <w:rPr>
-                <w:sz w:val="24"/>
+                <w:sz w:val="32"/>
               </w:rPr>
               <w:t>บริษัท สยามมาสเตอร์คอนกรีต จำกัด</w:t>
             </w:r>
@@ -149,13 +146,13 @@
       <w:tr>
         <w:tc>
           <w:tcPr>
-            <w:tcW w:type="dxa" w:w="2835"/>
+            <w:tcW w:type="dxa" w:w="3118"/>
             <w:shd w:val="clear" w:color="auto" w:fill="EBF5FB"/>
           </w:tcPr>
           <w:p>
             <w:r>
               <w:rPr>
-                <w:sz w:val="24"/>
+                <w:sz w:val="32"/>
               </w:rPr>
               <w:t>ประเภทธุรกิจ</w:t>
             </w:r>
@@ -163,13 +160,13 @@
         </w:tc>
         <w:tc>
           <w:tcPr>
-            <w:tcW w:type="dxa" w:w="5953"/>
+            <w:tcW w:type="dxa" w:w="5669"/>
             <w:shd w:val="clear" w:color="auto" w:fill="EBF5FB"/>
           </w:tcPr>
           <w:p>
             <w:r>
               <w:rPr>
-                <w:sz w:val="24"/>
+                <w:sz w:val="32"/>
               </w:rPr>
               <w:t>ผลิตและจำหน่ายคอนกรีตอัดแรงสำเร็จรูป (Prestressed Concrete)</w:t>
             </w:r>
@@ -179,12 +176,12 @@
       <w:tr>
         <w:tc>
           <w:tcPr>
-            <w:tcW w:type="dxa" w:w="2835"/>
+            <w:tcW w:type="dxa" w:w="3118"/>
           </w:tcPr>
           <w:p>
             <w:r>
               <w:rPr>
-                <w:sz w:val="24"/>
+                <w:sz w:val="32"/>
               </w:rPr>
               <w:t>ปีที่ก่อตั้ง</w:t>
             </w:r>
@@ -192,12 +189,12 @@
         </w:tc>
         <w:tc>
           <w:tcPr>
-            <w:tcW w:type="dxa" w:w="5953"/>
+            <w:tcW w:type="dxa" w:w="5669"/>
           </w:tcPr>
           <w:p>
             <w:r>
               <w:rPr>
-                <w:sz w:val="24"/>
+                <w:sz w:val="32"/>
               </w:rPr>
               <w:t>พ.ศ. 2537 — ประสบการณ์กว่า 30 ปี</w:t>
             </w:r>
@@ -207,13 +204,13 @@
       <w:tr>
         <w:tc>
           <w:tcPr>
-            <w:tcW w:type="dxa" w:w="2835"/>
+            <w:tcW w:type="dxa" w:w="3118"/>
             <w:shd w:val="clear" w:color="auto" w:fill="EBF5FB"/>
           </w:tcPr>
           <w:p>
             <w:r>
               <w:rPr>
-                <w:sz w:val="24"/>
+                <w:sz w:val="32"/>
               </w:rPr>
               <w:t>ภาษาที่ใช้</w:t>
             </w:r>
@@ -221,13 +218,13 @@
         </w:tc>
         <w:tc>
           <w:tcPr>
-            <w:tcW w:type="dxa" w:w="5953"/>
+            <w:tcW w:type="dxa" w:w="5669"/>
             <w:shd w:val="clear" w:color="auto" w:fill="EBF5FB"/>
           </w:tcPr>
           <w:p>
             <w:r>
               <w:rPr>
-                <w:sz w:val="24"/>
+                <w:sz w:val="32"/>
               </w:rPr>
               <w:t>ไทย และ อังกฤษ</w:t>
             </w:r>
@@ -237,12 +234,12 @@
       <w:tr>
         <w:tc>
           <w:tcPr>
-            <w:tcW w:type="dxa" w:w="2835"/>
+            <w:tcW w:type="dxa" w:w="3118"/>
           </w:tcPr>
           <w:p>
             <w:r>
               <w:rPr>
-                <w:sz w:val="24"/>
+                <w:sz w:val="32"/>
               </w:rPr>
               <w:t>ช่องทางติดต่อลูกค้า</w:t>
             </w:r>
@@ -250,14 +247,14 @@
         </w:tc>
         <w:tc>
           <w:tcPr>
-            <w:tcW w:type="dxa" w:w="5953"/>
+            <w:tcW w:type="dxa" w:w="5669"/>
           </w:tcPr>
           <w:p>
             <w:r>
               <w:rPr>
-                <w:sz w:val="24"/>
+                <w:sz w:val="32"/>
               </w:rPr>
-              <w:t>ออนไลน์  /  โทรศัพท์  /  เดินทางมาที่บริษัท (Walk-in)</w:t>
+              <w:t>ออนไลน์  /  โทรศัพท์  /  เดินทางมาที่บริษัท</w:t>
             </w:r>
           </w:p>
         </w:tc>
@@ -265,13 +262,13 @@
       <w:tr>
         <w:tc>
           <w:tcPr>
-            <w:tcW w:type="dxa" w:w="2835"/>
+            <w:tcW w:type="dxa" w:w="3118"/>
             <w:shd w:val="clear" w:color="auto" w:fill="EBF5FB"/>
           </w:tcPr>
           <w:p>
             <w:r>
               <w:rPr>
-                <w:sz w:val="24"/>
+                <w:sz w:val="32"/>
               </w:rPr>
               <w:t>ระบบสำหรับลูกค้า</w:t>
             </w:r>
@@ -279,13 +276,13 @@
         </w:tc>
         <w:tc>
           <w:tcPr>
-            <w:tcW w:type="dxa" w:w="5953"/>
+            <w:tcW w:type="dxa" w:w="5669"/>
             <w:shd w:val="clear" w:color="auto" w:fill="EBF5FB"/>
           </w:tcPr>
           <w:p>
             <w:r>
               <w:rPr>
-                <w:sz w:val="24"/>
+                <w:sz w:val="32"/>
               </w:rPr>
               <w:t>ไม่ต้องสมัครสมาชิก — ส่งคำขอใบเสนอราคาได้เลย</w:t>
             </w:r>
@@ -295,12 +292,12 @@
       <w:tr>
         <w:tc>
           <w:tcPr>
-            <w:tcW w:type="dxa" w:w="2835"/>
+            <w:tcW w:type="dxa" w:w="3118"/>
           </w:tcPr>
           <w:p>
             <w:r>
               <w:rPr>
-                <w:sz w:val="24"/>
+                <w:sz w:val="32"/>
               </w:rPr>
               <w:t>ระบบราคา</w:t>
             </w:r>
@@ -308,12 +305,12 @@
         </w:tc>
         <w:tc>
           <w:tcPr>
-            <w:tcW w:type="dxa" w:w="5953"/>
+            <w:tcW w:type="dxa" w:w="5669"/>
           </w:tcPr>
           <w:p>
             <w:r>
               <w:rPr>
-                <w:sz w:val="24"/>
+                <w:sz w:val="32"/>
               </w:rPr>
               <w:t>กำหนดราคาในระบบเอง ไม่เชื่อมต่อโปรแกรมภายนอก</w:t>
             </w:r>
@@ -330,7 +327,7 @@
         <w:rPr>
           <w:b/>
           <w:color w:val="1A56DB"/>
-          <w:sz w:val="30"/>
+          <w:sz w:val="38"/>
         </w:rPr>
         <w:t>จุดแข็งของบริษัท</w:t>
       </w:r>
@@ -342,7 +339,7 @@
       </w:pPr>
       <w:r>
         <w:rPr>
-          <w:sz w:val="26"/>
+          <w:sz w:val="34"/>
         </w:rPr>
         <w:t>ได้รับการรับรองมาตรฐาน มอก. — สร้างความมั่นใจให้ลูกค้า</w:t>
       </w:r>
@@ -354,7 +351,7 @@
       </w:pPr>
       <w:r>
         <w:rPr>
-          <w:sz w:val="26"/>
+          <w:sz w:val="34"/>
         </w:rPr>
         <w:t>แผ่นพื้น Hollow Core — มีผู้ผลิตน้อยในตลาด ได้เปรียบด้านการแข่งขัน</w:t>
       </w:r>
@@ -366,7 +363,7 @@
       </w:pPr>
       <w:r>
         <w:rPr>
-          <w:sz w:val="26"/>
+          <w:sz w:val="34"/>
         </w:rPr>
         <w:t>กำลังการผลิตสูง — รองรับโครงการขนาดใหญ่ได้</w:t>
       </w:r>
@@ -378,7 +375,7 @@
       </w:pPr>
       <w:r>
         <w:rPr>
-          <w:sz w:val="26"/>
+          <w:sz w:val="34"/>
         </w:rPr>
         <w:t>คุณภาพและความสวยงาม — ควบคุมกระบวนการผลิตจากโรงงาน ได้มาตรฐาน</w:t>
       </w:r>
@@ -392,7 +389,7 @@
         <w:rPr>
           <w:b/>
           <w:color w:val="1A56DB"/>
-          <w:sz w:val="36"/>
+          <w:sz w:val="44"/>
         </w:rPr>
         <w:t>2. ผลิตภัณฑ์หลัก</w:t>
       </w:r>
@@ -422,7 +419,7 @@
               <w:rPr>
                 <w:b/>
                 <w:color w:val="FFFFFF"/>
-                <w:sz w:val="24"/>
+                <w:sz w:val="32"/>
               </w:rPr>
               <w:t>ลำดับ</w:t>
             </w:r>
@@ -441,7 +438,7 @@
               <w:rPr>
                 <w:b/>
                 <w:color w:val="FFFFFF"/>
-                <w:sz w:val="24"/>
+                <w:sz w:val="32"/>
               </w:rPr>
               <w:t>ชื่อผลิตภัณฑ์</w:t>
             </w:r>
@@ -460,7 +457,7 @@
               <w:rPr>
                 <w:b/>
                 <w:color w:val="FFFFFF"/>
-                <w:sz w:val="24"/>
+                <w:sz w:val="32"/>
               </w:rPr>
               <w:t>การใช้งาน</w:t>
             </w:r>
@@ -475,7 +472,7 @@
           <w:p>
             <w:r>
               <w:rPr>
-                <w:sz w:val="24"/>
+                <w:sz w:val="32"/>
               </w:rPr>
               <w:t>1</w:t>
             </w:r>
@@ -488,7 +485,7 @@
           <w:p>
             <w:r>
               <w:rPr>
-                <w:sz w:val="24"/>
+                <w:sz w:val="32"/>
               </w:rPr>
               <w:t>เสาไฟฟ้าคอนกรีตอัดแรง</w:t>
             </w:r>
@@ -501,7 +498,7 @@
           <w:p>
             <w:r>
               <w:rPr>
-                <w:sz w:val="24"/>
+                <w:sz w:val="32"/>
               </w:rPr>
               <w:t>เสาไฟฟ้าแรงสูง สำหรับงานระบบสาธารณูปโภค</w:t>
             </w:r>
@@ -517,7 +514,7 @@
           <w:p>
             <w:r>
               <w:rPr>
-                <w:sz w:val="24"/>
+                <w:sz w:val="32"/>
               </w:rPr>
               <w:t>2</w:t>
             </w:r>
@@ -531,7 +528,7 @@
           <w:p>
             <w:r>
               <w:rPr>
-                <w:sz w:val="24"/>
+                <w:sz w:val="32"/>
               </w:rPr>
               <w:t>แผ่นพื้นสำเร็จรูป Hollow Core</w:t>
             </w:r>
@@ -545,7 +542,7 @@
           <w:p>
             <w:r>
               <w:rPr>
-                <w:sz w:val="24"/>
+                <w:sz w:val="32"/>
               </w:rPr>
               <w:t>พื้นสำเร็จรูป สำหรับอาคาร คอนโด คลังสินค้า อาคารจอดรถ</w:t>
             </w:r>
@@ -560,7 +557,7 @@
           <w:p>
             <w:r>
               <w:rPr>
-                <w:sz w:val="24"/>
+                <w:sz w:val="32"/>
               </w:rPr>
               <w:t>3</w:t>
             </w:r>
@@ -573,7 +570,7 @@
           <w:p>
             <w:r>
               <w:rPr>
-                <w:sz w:val="24"/>
+                <w:sz w:val="32"/>
               </w:rPr>
               <w:t>เสาเข็มคอนกรีตอัดแรง</w:t>
             </w:r>
@@ -586,7 +583,7 @@
           <w:p>
             <w:r>
               <w:rPr>
-                <w:sz w:val="24"/>
+                <w:sz w:val="32"/>
               </w:rPr>
               <w:t>งานฐานราก สำหรับบ้านจัดสรร อาคาร และโครงสร้างพื้นฐาน</w:t>
             </w:r>
@@ -603,9 +600,9 @@
         <w:rPr>
           <w:b/>
           <w:color w:val="1A56DB"/>
-          <w:sz w:val="36"/>
+          <w:sz w:val="44"/>
         </w:rPr>
-        <w:t>3. กลุ่มลูกค้าและเส้นทางการซื้อ</w:t>
+        <w:t>3. กลุ่มลูกค้าและขั้นตอนการซื้อ</w:t>
       </w:r>
     </w:p>
     <w:tbl>
@@ -634,7 +631,7 @@
               <w:rPr>
                 <w:b/>
                 <w:color w:val="FFFFFF"/>
-                <w:sz w:val="24"/>
+                <w:sz w:val="32"/>
               </w:rPr>
               <w:t>กลุ่มลูกค้า</w:t>
             </w:r>
@@ -653,7 +650,7 @@
               <w:rPr>
                 <w:b/>
                 <w:color w:val="FFFFFF"/>
-                <w:sz w:val="24"/>
+                <w:sz w:val="32"/>
               </w:rPr>
               <w:t>ลักษณะ</w:t>
             </w:r>
@@ -672,7 +669,7 @@
               <w:rPr>
                 <w:b/>
                 <w:color w:val="FFFFFF"/>
-                <w:sz w:val="24"/>
+                <w:sz w:val="32"/>
               </w:rPr>
               <w:t>ตัวอย่างงาน</w:t>
             </w:r>
@@ -691,7 +688,7 @@
               <w:rPr>
                 <w:b/>
                 <w:color w:val="FFFFFF"/>
-                <w:sz w:val="24"/>
+                <w:sz w:val="32"/>
               </w:rPr>
               <w:t>ขั้นตอนหลัก</w:t>
             </w:r>
@@ -706,7 +703,7 @@
           <w:p>
             <w:r>
               <w:rPr>
-                <w:sz w:val="24"/>
+                <w:sz w:val="32"/>
               </w:rPr>
               <w:t>ลูกค้าทั่วไป</w:t>
             </w:r>
@@ -719,9 +716,9 @@
           <w:p>
             <w:r>
               <w:rPr>
-                <w:sz w:val="24"/>
+                <w:sz w:val="32"/>
               </w:rPr>
-              <w:t>บุคคลทั่วไป / ผู้รับเหมารายย่อย</w:t>
+              <w:t>บุคคล / ผู้รับเหมารายย่อย</w:t>
             </w:r>
           </w:p>
         </w:tc>
@@ -732,9 +729,9 @@
           <w:p>
             <w:r>
               <w:rPr>
-                <w:sz w:val="24"/>
+                <w:sz w:val="32"/>
               </w:rPr>
-              <w:t>บ้านจัดสรร งานก่อสร้างขนาดเล็ก</w:t>
+              <w:t>บ้านจัดสรร งานก่อสร้างเล็ก</w:t>
             </w:r>
           </w:p>
         </w:tc>
@@ -745,7 +742,7 @@
           <w:p>
             <w:r>
               <w:rPr>
-                <w:sz w:val="24"/>
+                <w:sz w:val="32"/>
               </w:rPr>
               <w:t>ดูสินค้า → ขอใบเสนอราคา → ติดต่อ</w:t>
             </w:r>
@@ -761,7 +758,7 @@
           <w:p>
             <w:r>
               <w:rPr>
-                <w:sz w:val="24"/>
+                <w:sz w:val="32"/>
               </w:rPr>
               <w:t>ลูกค้าเอกชน</w:t>
             </w:r>
@@ -775,9 +772,9 @@
           <w:p>
             <w:r>
               <w:rPr>
-                <w:sz w:val="24"/>
+                <w:sz w:val="32"/>
               </w:rPr>
-              <w:t>บริษัทรับเหมา / ผู้พัฒนาอสังหาริมทรัพย์</w:t>
+              <w:t>บริษัทรับเหมา / ผู้พัฒนาอสังหาฯ</w:t>
             </w:r>
           </w:p>
         </w:tc>
@@ -789,7 +786,7 @@
           <w:p>
             <w:r>
               <w:rPr>
-                <w:sz w:val="24"/>
+                <w:sz w:val="32"/>
               </w:rPr>
               <w:t>อาคาร คลังสินค้า โรงงาน คอนโด</w:t>
             </w:r>
@@ -803,7 +800,7 @@
           <w:p>
             <w:r>
               <w:rPr>
-                <w:sz w:val="24"/>
+                <w:sz w:val="32"/>
               </w:rPr>
               <w:t>ดูสินค้า → ดูสเปค → ขอใบเสนอราคา → เจรจา</w:t>
             </w:r>
@@ -818,7 +815,7 @@
           <w:p>
             <w:r>
               <w:rPr>
-                <w:sz w:val="24"/>
+                <w:sz w:val="32"/>
               </w:rPr>
               <w:t>ลูกค้าภาครัฐ</w:t>
             </w:r>
@@ -831,7 +828,7 @@
           <w:p>
             <w:r>
               <w:rPr>
-                <w:sz w:val="24"/>
+                <w:sz w:val="32"/>
               </w:rPr>
               <w:t>หน่วยงานราชการ / รัฐวิสาหกิจ</w:t>
             </w:r>
@@ -844,7 +841,7 @@
           <w:p>
             <w:r>
               <w:rPr>
-                <w:sz w:val="24"/>
+                <w:sz w:val="32"/>
               </w:rPr>
               <w:t>สะพาน ถนน รถไฟ สาธารณูปโภค</w:t>
             </w:r>
@@ -857,7 +854,7 @@
           <w:p>
             <w:r>
               <w:rPr>
-                <w:sz w:val="24"/>
+                <w:sz w:val="32"/>
               </w:rPr>
               <w:t>ดูเอกสาร → ข้อมูลประกวดราคา → ติดต่อ</w:t>
             </w:r>
@@ -874,7 +871,7 @@
         <w:rPr>
           <w:b/>
           <w:color w:val="1A56DB"/>
-          <w:sz w:val="36"/>
+          <w:sz w:val="44"/>
         </w:rPr>
         <w:t>4. รายการฟีเจอร์ทั้งหมด</w:t>
       </w:r>
@@ -887,9 +884,9 @@
         <w:rPr>
           <w:b/>
           <w:color w:val="1A56DB"/>
-          <w:sz w:val="30"/>
+          <w:sz w:val="38"/>
         </w:rPr>
-        <w:t>4.1  การนำเสนอบริษัท (Company Storytelling)</w:t>
+        <w:t>4.1  การนำเสนอบริษัท</w:t>
       </w:r>
     </w:p>
     <w:tbl>
@@ -917,7 +914,7 @@
               <w:rPr>
                 <w:b/>
                 <w:color w:val="FFFFFF"/>
-                <w:sz w:val="24"/>
+                <w:sz w:val="32"/>
               </w:rPr>
               <w:t>ฟีเจอร์</w:t>
             </w:r>
@@ -936,7 +933,7 @@
               <w:rPr>
                 <w:b/>
                 <w:color w:val="FFFFFF"/>
-                <w:sz w:val="24"/>
+                <w:sz w:val="32"/>
               </w:rPr>
               <w:t>รายละเอียด</w:t>
             </w:r>
@@ -955,7 +952,7 @@
               <w:rPr>
                 <w:b/>
                 <w:color w:val="FFFFFF"/>
-                <w:sz w:val="24"/>
+                <w:sz w:val="32"/>
               </w:rPr>
               <w:t>ความสำคัญ</w:t>
             </w:r>
@@ -970,9 +967,9 @@
           <w:p>
             <w:r>
               <w:rPr>
-                <w:sz w:val="24"/>
+                <w:sz w:val="32"/>
               </w:rPr>
-              <w:t>หน้าแรก (Landing Page)</w:t>
+              <w:t>หน้าแรก</w:t>
             </w:r>
           </w:p>
         </w:tc>
@@ -983,9 +980,9 @@
           <w:p>
             <w:r>
               <w:rPr>
-                <w:sz w:val="24"/>
+                <w:sz w:val="32"/>
               </w:rPr>
-              <w:t>ส่วนแนะนำบริษัท จุดเด่น และปุ่มขอใบเสนอราคา</w:t>
+              <w:t>ส่วนแนะนำบริษัท จุดเด่น ปุ่มขอใบเสนอราคา</w:t>
             </w:r>
           </w:p>
         </w:tc>
@@ -996,7 +993,7 @@
           <w:p>
             <w:r>
               <w:rPr>
-                <w:sz w:val="24"/>
+                <w:sz w:val="32"/>
               </w:rPr>
               <w:t>ต้องมี</w:t>
             </w:r>
@@ -1012,7 +1009,7 @@
           <w:p>
             <w:r>
               <w:rPr>
-                <w:sz w:val="24"/>
+                <w:sz w:val="32"/>
               </w:rPr>
               <w:t>เกี่ยวกับเรา</w:t>
             </w:r>
@@ -1026,7 +1023,7 @@
           <w:p>
             <w:r>
               <w:rPr>
-                <w:sz w:val="24"/>
+                <w:sz w:val="32"/>
               </w:rPr>
               <w:t>ประวัติบริษัท 30 ปี วิสัยทัศน์ ค่านิยม ทีมงาน</w:t>
             </w:r>
@@ -1040,7 +1037,7 @@
           <w:p>
             <w:r>
               <w:rPr>
-                <w:sz w:val="24"/>
+                <w:sz w:val="32"/>
               </w:rPr>
               <w:t>ต้องมี</w:t>
             </w:r>
@@ -1055,7 +1052,7 @@
           <w:p>
             <w:r>
               <w:rPr>
-                <w:sz w:val="24"/>
+                <w:sz w:val="32"/>
               </w:rPr>
               <w:t>ความน่าเชื่อถือ</w:t>
             </w:r>
@@ -1068,7 +1065,7 @@
           <w:p>
             <w:r>
               <w:rPr>
-                <w:sz w:val="24"/>
+                <w:sz w:val="32"/>
               </w:rPr>
               <w:t>โลโก้ มอก. ใบรับรองมาตรฐาน สถิติโปรเจกต์ที่ผ่านมา</w:t>
             </w:r>
@@ -1081,7 +1078,7 @@
           <w:p>
             <w:r>
               <w:rPr>
-                <w:sz w:val="24"/>
+                <w:sz w:val="32"/>
               </w:rPr>
               <w:t>ต้องมี</w:t>
             </w:r>
@@ -1097,9 +1094,9 @@
           <w:p>
             <w:r>
               <w:rPr>
-                <w:sz w:val="24"/>
+                <w:sz w:val="32"/>
               </w:rPr>
-              <w:t>ผลงานอ้างอิง (Portfolio)</w:t>
+              <w:t>ผลงานอ้างอิง</w:t>
             </w:r>
           </w:p>
         </w:tc>
@@ -1111,7 +1108,7 @@
           <w:p>
             <w:r>
               <w:rPr>
-                <w:sz w:val="24"/>
+                <w:sz w:val="32"/>
               </w:rPr>
               <w:t>ภาพและรายละเอียดโปรเจกต์ที่เคยทำ แยกตามประเภทงาน</w:t>
             </w:r>
@@ -1125,7 +1122,7 @@
           <w:p>
             <w:r>
               <w:rPr>
-                <w:sz w:val="24"/>
+                <w:sz w:val="32"/>
               </w:rPr>
               <w:t>ควรมี</w:t>
             </w:r>
@@ -1140,7 +1137,7 @@
           <w:p>
             <w:r>
               <w:rPr>
-                <w:sz w:val="24"/>
+                <w:sz w:val="32"/>
               </w:rPr>
               <w:t>ข่าวสาร / บทความ</w:t>
             </w:r>
@@ -1153,7 +1150,7 @@
           <w:p>
             <w:r>
               <w:rPr>
-                <w:sz w:val="24"/>
+                <w:sz w:val="32"/>
               </w:rPr>
               <w:t>ข่าวบริษัท บทความให้ความรู้เรื่องคอนกรีตอัดแรง</w:t>
             </w:r>
@@ -1166,7 +1163,7 @@
           <w:p>
             <w:r>
               <w:rPr>
-                <w:sz w:val="24"/>
+                <w:sz w:val="32"/>
               </w:rPr>
               <w:t>มีถ้าเวลาเหลือ</w:t>
             </w:r>
@@ -1183,9 +1180,9 @@
         <w:rPr>
           <w:b/>
           <w:color w:val="1A56DB"/>
-          <w:sz w:val="30"/>
+          <w:sz w:val="38"/>
         </w:rPr>
-        <w:t>4.2  แคตาล็อกสินค้า (Product Catalog)</w:t>
+        <w:t>4.2  แคตาล็อกสินค้า</w:t>
       </w:r>
     </w:p>
     <w:tbl>
@@ -1213,7 +1210,7 @@
               <w:rPr>
                 <w:b/>
                 <w:color w:val="FFFFFF"/>
-                <w:sz w:val="24"/>
+                <w:sz w:val="32"/>
               </w:rPr>
               <w:t>ฟีเจอร์</w:t>
             </w:r>
@@ -1232,7 +1229,7 @@
               <w:rPr>
                 <w:b/>
                 <w:color w:val="FFFFFF"/>
-                <w:sz w:val="24"/>
+                <w:sz w:val="32"/>
               </w:rPr>
               <w:t>รายละเอียด</w:t>
             </w:r>
@@ -1251,7 +1248,7 @@
               <w:rPr>
                 <w:b/>
                 <w:color w:val="FFFFFF"/>
-                <w:sz w:val="24"/>
+                <w:sz w:val="32"/>
               </w:rPr>
               <w:t>ความสำคัญ</w:t>
             </w:r>
@@ -1266,7 +1263,7 @@
           <w:p>
             <w:r>
               <w:rPr>
-                <w:sz w:val="24"/>
+                <w:sz w:val="32"/>
               </w:rPr>
               <w:t>รายการสินค้าทั้งหมด</w:t>
             </w:r>
@@ -1279,7 +1276,7 @@
           <w:p>
             <w:r>
               <w:rPr>
-                <w:sz w:val="24"/>
+                <w:sz w:val="32"/>
               </w:rPr>
               <w:t>แสดงสินค้าครบทั้ง 3 รายการ พร้อมรูปภาพ</w:t>
             </w:r>
@@ -1292,7 +1289,7 @@
           <w:p>
             <w:r>
               <w:rPr>
-                <w:sz w:val="24"/>
+                <w:sz w:val="32"/>
               </w:rPr>
               <w:t>ต้องมี</w:t>
             </w:r>
@@ -1308,7 +1305,7 @@
           <w:p>
             <w:r>
               <w:rPr>
-                <w:sz w:val="24"/>
+                <w:sz w:val="32"/>
               </w:rPr>
               <w:t>หน้าสินค้าแต่ละรายการ</w:t>
             </w:r>
@@ -1322,7 +1319,7 @@
           <w:p>
             <w:r>
               <w:rPr>
-                <w:sz w:val="24"/>
+                <w:sz w:val="32"/>
               </w:rPr>
               <w:t>สเปคครบ ขนาด น้ำหนัก กำลังรับแรง ตัวอย่างการใช้งาน รูปภาพ</w:t>
             </w:r>
@@ -1336,7 +1333,7 @@
           <w:p>
             <w:r>
               <w:rPr>
-                <w:sz w:val="24"/>
+                <w:sz w:val="32"/>
               </w:rPr>
               <w:t>ต้องมี</w:t>
             </w:r>
@@ -1351,9 +1348,9 @@
           <w:p>
             <w:r>
               <w:rPr>
-                <w:sz w:val="24"/>
+                <w:sz w:val="32"/>
               </w:rPr>
-              <w:t>ดาวน์โหลดใบสเปค (Datasheet)</w:t>
+              <w:t>ดาวน์โหลดใบสเปค</w:t>
             </w:r>
           </w:p>
         </w:tc>
@@ -1364,7 +1361,7 @@
           <w:p>
             <w:r>
               <w:rPr>
-                <w:sz w:val="24"/>
+                <w:sz w:val="32"/>
               </w:rPr>
               <w:t>ไฟล์ PDF สเปคสินค้า และใบรับรอง มอก. ดาวน์โหลดได้</w:t>
             </w:r>
@@ -1377,7 +1374,7 @@
           <w:p>
             <w:r>
               <w:rPr>
-                <w:sz w:val="24"/>
+                <w:sz w:val="32"/>
               </w:rPr>
               <w:t>ต้องมี</w:t>
             </w:r>
@@ -1393,7 +1390,7 @@
           <w:p>
             <w:r>
               <w:rPr>
-                <w:sz w:val="24"/>
+                <w:sz w:val="32"/>
               </w:rPr>
               <w:t>กรองสินค้า</w:t>
             </w:r>
@@ -1407,7 +1404,7 @@
           <w:p>
             <w:r>
               <w:rPr>
-                <w:sz w:val="24"/>
+                <w:sz w:val="32"/>
               </w:rPr>
               <w:t>กรองตามประเภทสินค้า หรือประเภทการใช้งาน</w:t>
             </w:r>
@@ -1421,7 +1418,7 @@
           <w:p>
             <w:r>
               <w:rPr>
-                <w:sz w:val="24"/>
+                <w:sz w:val="32"/>
               </w:rPr>
               <w:t>ควรมี</w:t>
             </w:r>
@@ -1436,7 +1433,7 @@
           <w:p>
             <w:r>
               <w:rPr>
-                <w:sz w:val="24"/>
+                <w:sz w:val="32"/>
               </w:rPr>
               <w:t>เปรียบเทียบสินค้า</w:t>
             </w:r>
@@ -1449,7 +1446,7 @@
           <w:p>
             <w:r>
               <w:rPr>
-                <w:sz w:val="24"/>
+                <w:sz w:val="32"/>
               </w:rPr>
               <w:t>เปรียบเทียบสเปคระหว่างสินค้าได้</w:t>
             </w:r>
@@ -1462,7 +1459,7 @@
           <w:p>
             <w:r>
               <w:rPr>
-                <w:sz w:val="24"/>
+                <w:sz w:val="32"/>
               </w:rPr>
               <w:t>มีถ้าเวลาเหลือ</w:t>
             </w:r>
@@ -1479,9 +1476,9 @@
         <w:rPr>
           <w:b/>
           <w:color w:val="1A56DB"/>
-          <w:sz w:val="30"/>
+          <w:sz w:val="38"/>
         </w:rPr>
-        <w:t>4.3  ระบบขอใบเสนอราคา (RFQ)</w:t>
+        <w:t>4.3  ระบบขอใบเสนอราคา</w:t>
       </w:r>
     </w:p>
     <w:tbl>
@@ -1509,7 +1506,7 @@
               <w:rPr>
                 <w:b/>
                 <w:color w:val="FFFFFF"/>
-                <w:sz w:val="24"/>
+                <w:sz w:val="32"/>
               </w:rPr>
               <w:t>ฟีเจอร์</w:t>
             </w:r>
@@ -1528,7 +1525,7 @@
               <w:rPr>
                 <w:b/>
                 <w:color w:val="FFFFFF"/>
-                <w:sz w:val="24"/>
+                <w:sz w:val="32"/>
               </w:rPr>
               <w:t>รายละเอียด</w:t>
             </w:r>
@@ -1547,7 +1544,7 @@
               <w:rPr>
                 <w:b/>
                 <w:color w:val="FFFFFF"/>
-                <w:sz w:val="24"/>
+                <w:sz w:val="32"/>
               </w:rPr>
               <w:t>ความสำคัญ</w:t>
             </w:r>
@@ -1562,7 +1559,7 @@
           <w:p>
             <w:r>
               <w:rPr>
-                <w:sz w:val="24"/>
+                <w:sz w:val="32"/>
               </w:rPr>
               <w:t>แบบฟอร์ม — ลูกค้าทั่วไป</w:t>
             </w:r>
@@ -1575,9 +1572,9 @@
           <w:p>
             <w:r>
               <w:rPr>
-                <w:sz w:val="24"/>
+                <w:sz w:val="32"/>
               </w:rPr>
-              <w:t>ชื่อ เบอร์โทร อีเมล สินค้าที่สนใจ ปริมาณ ข้อความเพิ่มเติม</w:t>
+              <w:t>ชื่อ เบอร์โทร อีเมล สินค้าที่สนใจ ปริมาณ ข้อความ</w:t>
             </w:r>
           </w:p>
         </w:tc>
@@ -1588,7 +1585,7 @@
           <w:p>
             <w:r>
               <w:rPr>
-                <w:sz w:val="24"/>
+                <w:sz w:val="32"/>
               </w:rPr>
               <w:t>ต้องมี</w:t>
             </w:r>
@@ -1604,7 +1601,7 @@
           <w:p>
             <w:r>
               <w:rPr>
-                <w:sz w:val="24"/>
+                <w:sz w:val="32"/>
               </w:rPr>
               <w:t>แบบฟอร์ม — ลูกค้าเอกชน</w:t>
             </w:r>
@@ -1618,7 +1615,7 @@
           <w:p>
             <w:r>
               <w:rPr>
-                <w:sz w:val="24"/>
+                <w:sz w:val="32"/>
               </w:rPr>
               <w:t>ข้อมูลบริษัท ประเภทโปรเจกต์ แนบไฟล์แบบก่อสร้างได้</w:t>
             </w:r>
@@ -1632,7 +1629,7 @@
           <w:p>
             <w:r>
               <w:rPr>
-                <w:sz w:val="24"/>
+                <w:sz w:val="32"/>
               </w:rPr>
               <w:t>ต้องมี</w:t>
             </w:r>
@@ -1647,7 +1644,7 @@
           <w:p>
             <w:r>
               <w:rPr>
-                <w:sz w:val="24"/>
+                <w:sz w:val="32"/>
               </w:rPr>
               <w:t>แบบฟอร์ม — ลูกค้าภาครัฐ</w:t>
             </w:r>
@@ -1660,7 +1657,7 @@
           <w:p>
             <w:r>
               <w:rPr>
-                <w:sz w:val="24"/>
+                <w:sz w:val="32"/>
               </w:rPr>
               <w:t>ข้อมูลหน่วยงาน เลขที่จัดซื้อจัดจ้าง แนบเอกสารได้</w:t>
             </w:r>
@@ -1673,7 +1670,7 @@
           <w:p>
             <w:r>
               <w:rPr>
-                <w:sz w:val="24"/>
+                <w:sz w:val="32"/>
               </w:rPr>
               <w:t>ต้องมี</w:t>
             </w:r>
@@ -1689,7 +1686,7 @@
           <w:p>
             <w:r>
               <w:rPr>
-                <w:sz w:val="24"/>
+                <w:sz w:val="32"/>
               </w:rPr>
               <w:t>แจ้งเตือนอีเมล</w:t>
             </w:r>
@@ -1703,9 +1700,9 @@
           <w:p>
             <w:r>
               <w:rPr>
-                <w:sz w:val="24"/>
+                <w:sz w:val="32"/>
               </w:rPr>
-              <w:t>ส่งอีเมลยืนยันให้ลูกค้า และแจ้งเตือนผู้ดูแลระบบ</w:t>
+              <w:t>ส่งอีเมลยืนยันให้ลูกค้า + แจ้งเตือนผู้ดูแลระบบ</w:t>
             </w:r>
           </w:p>
         </w:tc>
@@ -1717,7 +1714,7 @@
           <w:p>
             <w:r>
               <w:rPr>
-                <w:sz w:val="24"/>
+                <w:sz w:val="32"/>
               </w:rPr>
               <w:t>ต้องมี</w:t>
             </w:r>
@@ -1732,7 +1729,7 @@
           <w:p>
             <w:r>
               <w:rPr>
-                <w:sz w:val="24"/>
+                <w:sz w:val="32"/>
               </w:rPr>
               <w:t>หน้ายืนยันการส่ง</w:t>
             </w:r>
@@ -1745,7 +1742,7 @@
           <w:p>
             <w:r>
               <w:rPr>
-                <w:sz w:val="24"/>
+                <w:sz w:val="32"/>
               </w:rPr>
               <w:t>แสดงรหัสอ้างอิง และสรุปข้อมูลที่ส่งมา</w:t>
             </w:r>
@@ -1758,7 +1755,7 @@
           <w:p>
             <w:r>
               <w:rPr>
-                <w:sz w:val="24"/>
+                <w:sz w:val="32"/>
               </w:rPr>
               <w:t>ต้องมี</w:t>
             </w:r>
@@ -1774,7 +1771,7 @@
           <w:p>
             <w:r>
               <w:rPr>
-                <w:sz w:val="24"/>
+                <w:sz w:val="32"/>
               </w:rPr>
               <w:t>ติดตามสถานะคำขอ</w:t>
             </w:r>
@@ -1788,7 +1785,7 @@
           <w:p>
             <w:r>
               <w:rPr>
-                <w:sz w:val="24"/>
+                <w:sz w:val="32"/>
               </w:rPr>
               <w:t>ลูกค้าตรวจสอบสถานะได้ด้วยรหัสอ้างอิง</w:t>
             </w:r>
@@ -1802,7 +1799,7 @@
           <w:p>
             <w:r>
               <w:rPr>
-                <w:sz w:val="24"/>
+                <w:sz w:val="32"/>
               </w:rPr>
               <w:t>ควรมี</w:t>
             </w:r>
@@ -1819,9 +1816,9 @@
         <w:rPr>
           <w:b/>
           <w:color w:val="1A56DB"/>
-          <w:sz w:val="30"/>
+          <w:sz w:val="38"/>
         </w:rPr>
-        <w:t>4.4  หน้าจัดการสำหรับผู้ดูแลระบบ (Admin)</w:t>
+        <w:t>4.4  หน้าจัดการผู้ดูแลระบบ (Admin)</w:t>
       </w:r>
     </w:p>
     <w:tbl>
@@ -1849,7 +1846,7 @@
               <w:rPr>
                 <w:b/>
                 <w:color w:val="FFFFFF"/>
-                <w:sz w:val="24"/>
+                <w:sz w:val="32"/>
               </w:rPr>
               <w:t>ฟีเจอร์</w:t>
             </w:r>
@@ -1868,7 +1865,7 @@
               <w:rPr>
                 <w:b/>
                 <w:color w:val="FFFFFF"/>
-                <w:sz w:val="24"/>
+                <w:sz w:val="32"/>
               </w:rPr>
               <w:t>รายละเอียด</w:t>
             </w:r>
@@ -1887,7 +1884,7 @@
               <w:rPr>
                 <w:b/>
                 <w:color w:val="FFFFFF"/>
-                <w:sz w:val="24"/>
+                <w:sz w:val="32"/>
               </w:rPr>
               <w:t>ความสำคัญ</w:t>
             </w:r>
@@ -1902,7 +1899,7 @@
           <w:p>
             <w:r>
               <w:rPr>
-                <w:sz w:val="24"/>
+                <w:sz w:val="32"/>
               </w:rPr>
               <w:t>เข้าสู่ระบบผู้ดูแล</w:t>
             </w:r>
@@ -1915,9 +1912,9 @@
           <w:p>
             <w:r>
               <w:rPr>
-                <w:sz w:val="24"/>
+                <w:sz w:val="32"/>
               </w:rPr>
-              <w:t>ชื่อผู้ใช้ + รหัสผ่าน ระบบรักษาความปลอดภัยด้วย JWT</w:t>
+              <w:t>ชื่อผู้ใช้ + รหัสผ่าน รักษาความปลอดภัยด้วย JWT</w:t>
             </w:r>
           </w:p>
         </w:tc>
@@ -1928,7 +1925,7 @@
           <w:p>
             <w:r>
               <w:rPr>
-                <w:sz w:val="24"/>
+                <w:sz w:val="32"/>
               </w:rPr>
               <w:t>ต้องมี</w:t>
             </w:r>
@@ -1944,7 +1941,7 @@
           <w:p>
             <w:r>
               <w:rPr>
-                <w:sz w:val="24"/>
+                <w:sz w:val="32"/>
               </w:rPr>
               <w:t>รายการคำขอใบเสนอราคา</w:t>
             </w:r>
@@ -1958,7 +1955,7 @@
           <w:p>
             <w:r>
               <w:rPr>
-                <w:sz w:val="24"/>
+                <w:sz w:val="32"/>
               </w:rPr>
               <w:t>ดูคำขอทั้งหมด กรองตามสถานะ วันที่ กลุ่มลูกค้า</w:t>
             </w:r>
@@ -1972,7 +1969,7 @@
           <w:p>
             <w:r>
               <w:rPr>
-                <w:sz w:val="24"/>
+                <w:sz w:val="32"/>
               </w:rPr>
               <w:t>ต้องมี</w:t>
             </w:r>
@@ -1987,9 +1984,9 @@
           <w:p>
             <w:r>
               <w:rPr>
-                <w:sz w:val="24"/>
+                <w:sz w:val="32"/>
               </w:rPr>
-              <w:t>จัดการคำขอใบเสนอราคา</w:t>
+              <w:t>จัดการคำขอ</w:t>
             </w:r>
           </w:p>
         </w:tc>
@@ -2000,7 +1997,7 @@
           <w:p>
             <w:r>
               <w:rPr>
-                <w:sz w:val="24"/>
+                <w:sz w:val="32"/>
               </w:rPr>
               <w:t>เปลี่ยนสถานะ: ใหม่ → กำลังดำเนินการ → เสร็จสิ้น</w:t>
             </w:r>
@@ -2013,7 +2010,7 @@
           <w:p>
             <w:r>
               <w:rPr>
-                <w:sz w:val="24"/>
+                <w:sz w:val="32"/>
               </w:rPr>
               <w:t>ต้องมี</w:t>
             </w:r>
@@ -2029,7 +2026,7 @@
           <w:p>
             <w:r>
               <w:rPr>
-                <w:sz w:val="24"/>
+                <w:sz w:val="32"/>
               </w:rPr>
               <w:t>จัดการสินค้า</w:t>
             </w:r>
@@ -2043,7 +2040,7 @@
           <w:p>
             <w:r>
               <w:rPr>
-                <w:sz w:val="24"/>
+                <w:sz w:val="32"/>
               </w:rPr>
               <w:t>เพิ่ม แก้ไข ลบข้อมูลสินค้า อัปโหลดรูปภาพและใบสเปค</w:t>
             </w:r>
@@ -2057,7 +2054,7 @@
           <w:p>
             <w:r>
               <w:rPr>
-                <w:sz w:val="24"/>
+                <w:sz w:val="32"/>
               </w:rPr>
               <w:t>ต้องมี</w:t>
             </w:r>
@@ -2072,7 +2069,7 @@
           <w:p>
             <w:r>
               <w:rPr>
-                <w:sz w:val="24"/>
+                <w:sz w:val="32"/>
               </w:rPr>
               <w:t>จัดการเนื้อหา</w:t>
             </w:r>
@@ -2085,7 +2082,7 @@
           <w:p>
             <w:r>
               <w:rPr>
-                <w:sz w:val="24"/>
+                <w:sz w:val="32"/>
               </w:rPr>
               <w:t>แก้ไขหน้าเกี่ยวกับเรา ผลงาน ข่าวสาร</w:t>
             </w:r>
@@ -2098,7 +2095,7 @@
           <w:p>
             <w:r>
               <w:rPr>
-                <w:sz w:val="24"/>
+                <w:sz w:val="32"/>
               </w:rPr>
               <w:t>ควรมี</w:t>
             </w:r>
@@ -2114,7 +2111,7 @@
           <w:p>
             <w:r>
               <w:rPr>
-                <w:sz w:val="24"/>
+                <w:sz w:val="32"/>
               </w:rPr>
               <w:t>สรุปภาพรวม (Dashboard)</w:t>
             </w:r>
@@ -2128,7 +2125,7 @@
           <w:p>
             <w:r>
               <w:rPr>
-                <w:sz w:val="24"/>
+                <w:sz w:val="32"/>
               </w:rPr>
               <w:t>จำนวนคำขอวันนี้ เดือนนี้ กราฟสถิติ</w:t>
             </w:r>
@@ -2142,7 +2139,7 @@
           <w:p>
             <w:r>
               <w:rPr>
-                <w:sz w:val="24"/>
+                <w:sz w:val="32"/>
               </w:rPr>
               <w:t>มีถ้าเวลาเหลือ</w:t>
             </w:r>
@@ -2157,7 +2154,7 @@
           <w:p>
             <w:r>
               <w:rPr>
-                <w:sz w:val="24"/>
+                <w:sz w:val="32"/>
               </w:rPr>
               <w:t>ส่งออกรายงาน</w:t>
             </w:r>
@@ -2170,7 +2167,7 @@
           <w:p>
             <w:r>
               <w:rPr>
-                <w:sz w:val="24"/>
+                <w:sz w:val="32"/>
               </w:rPr>
               <w:t>ส่งออกรายการคำขอเป็นไฟล์ Excel</w:t>
             </w:r>
@@ -2183,7 +2180,7 @@
           <w:p>
             <w:r>
               <w:rPr>
-                <w:sz w:val="24"/>
+                <w:sz w:val="32"/>
               </w:rPr>
               <w:t>มีถ้าเวลาเหลือ</w:t>
             </w:r>
@@ -2200,9 +2197,9 @@
         <w:rPr>
           <w:b/>
           <w:color w:val="1A56DB"/>
-          <w:sz w:val="30"/>
+          <w:sz w:val="38"/>
         </w:rPr>
-        <w:t>4.5  พื้นที่สำหรับลูกค้า (ระยะที่ 3 — เพิ่มเติม)</w:t>
+        <w:t>4.5  พื้นที่สำหรับลูกค้า (ระยะที่ 3)</w:t>
       </w:r>
     </w:p>
     <w:tbl>
@@ -2230,7 +2227,7 @@
               <w:rPr>
                 <w:b/>
                 <w:color w:val="FFFFFF"/>
-                <w:sz w:val="24"/>
+                <w:sz w:val="32"/>
               </w:rPr>
               <w:t>ฟีเจอร์</w:t>
             </w:r>
@@ -2249,7 +2246,7 @@
               <w:rPr>
                 <w:b/>
                 <w:color w:val="FFFFFF"/>
-                <w:sz w:val="24"/>
+                <w:sz w:val="32"/>
               </w:rPr>
               <w:t>รายละเอียด</w:t>
             </w:r>
@@ -2268,7 +2265,7 @@
               <w:rPr>
                 <w:b/>
                 <w:color w:val="FFFFFF"/>
-                <w:sz w:val="24"/>
+                <w:sz w:val="32"/>
               </w:rPr>
               <w:t>ความสำคัญ</w:t>
             </w:r>
@@ -2283,7 +2280,7 @@
           <w:p>
             <w:r>
               <w:rPr>
-                <w:sz w:val="24"/>
+                <w:sz w:val="32"/>
               </w:rPr>
               <w:t>เข้าสู่ระบบลูกค้าเอกชน</w:t>
             </w:r>
@@ -2296,7 +2293,7 @@
           <w:p>
             <w:r>
               <w:rPr>
-                <w:sz w:val="24"/>
+                <w:sz w:val="32"/>
               </w:rPr>
               <w:t>บัญชีสำหรับลูกค้าที่สั่งซื้อประจำ</w:t>
             </w:r>
@@ -2309,7 +2306,7 @@
           <w:p>
             <w:r>
               <w:rPr>
-                <w:sz w:val="24"/>
+                <w:sz w:val="32"/>
               </w:rPr>
               <w:t>มีถ้าเวลาเหลือ</w:t>
             </w:r>
@@ -2325,7 +2322,7 @@
           <w:p>
             <w:r>
               <w:rPr>
-                <w:sz w:val="24"/>
+                <w:sz w:val="32"/>
               </w:rPr>
               <w:t>ประวัติการขอใบเสนอราคา</w:t>
             </w:r>
@@ -2339,7 +2336,7 @@
           <w:p>
             <w:r>
               <w:rPr>
-                <w:sz w:val="24"/>
+                <w:sz w:val="32"/>
               </w:rPr>
               <w:t>ดูรายการที่เคยส่ง พร้อมสถานะล่าสุด</w:t>
             </w:r>
@@ -2353,7 +2350,7 @@
           <w:p>
             <w:r>
               <w:rPr>
-                <w:sz w:val="24"/>
+                <w:sz w:val="32"/>
               </w:rPr>
               <w:t>มีถ้าเวลาเหลือ</w:t>
             </w:r>
@@ -2368,9 +2365,9 @@
           <w:p>
             <w:r>
               <w:rPr>
-                <w:sz w:val="24"/>
+                <w:sz w:val="32"/>
               </w:rPr>
-              <w:t>เอกสารสำหรับลูกค้าภาครัฐ</w:t>
+              <w:t>เอกสารลูกค้าภาครัฐ</w:t>
             </w:r>
           </w:p>
         </w:tc>
@@ -2381,7 +2378,7 @@
           <w:p>
             <w:r>
               <w:rPr>
-                <w:sz w:val="24"/>
+                <w:sz w:val="32"/>
               </w:rPr>
               <w:t>ข้อมูลและเอกสารประกอบการจัดซื้อจัดจ้าง</w:t>
             </w:r>
@@ -2394,7 +2391,7 @@
           <w:p>
             <w:r>
               <w:rPr>
-                <w:sz w:val="24"/>
+                <w:sz w:val="32"/>
               </w:rPr>
               <w:t>มีถ้าเวลาเหลือ</w:t>
             </w:r>
@@ -2411,9 +2408,488 @@
         <w:rPr>
           <w:b/>
           <w:color w:val="1A56DB"/>
-          <w:sz w:val="36"/>
+          <w:sz w:val="44"/>
         </w:rPr>
         <w:t>5. เทคโนโลยีที่ใช้</w:t>
+      </w:r>
+    </w:p>
+    <w:tbl>
+      <w:tblPr>
+        <w:tblStyle w:val="TableGrid"/>
+        <w:tblW w:type="auto" w:w="0"/>
+        <w:tblLook w:firstColumn="1" w:firstRow="1" w:lastColumn="0" w:lastRow="0" w:noHBand="0" w:noVBand="1" w:val="04A0"/>
+      </w:tblPr>
+      <w:tblGrid>
+        <w:gridCol w:w="3041"/>
+        <w:gridCol w:w="3041"/>
+        <w:gridCol w:w="3041"/>
+      </w:tblGrid>
+      <w:tr>
+        <w:tc>
+          <w:tcPr>
+            <w:tcW w:type="dxa" w:w="2551"/>
+            <w:shd w:val="clear" w:color="auto" w:fill="1A56DB"/>
+          </w:tcPr>
+          <w:p>
+            <w:pPr>
+              <w:jc w:val="center"/>
+            </w:pPr>
+            <w:r>
+              <w:rPr>
+                <w:b/>
+                <w:color w:val="FFFFFF"/>
+                <w:sz w:val="32"/>
+              </w:rPr>
+              <w:t>ส่วน</w:t>
+            </w:r>
+          </w:p>
+        </w:tc>
+        <w:tc>
+          <w:tcPr>
+            <w:tcW w:type="dxa" w:w="2835"/>
+            <w:shd w:val="clear" w:color="auto" w:fill="1A56DB"/>
+          </w:tcPr>
+          <w:p>
+            <w:pPr>
+              <w:jc w:val="center"/>
+            </w:pPr>
+            <w:r>
+              <w:rPr>
+                <w:b/>
+                <w:color w:val="FFFFFF"/>
+                <w:sz w:val="32"/>
+              </w:rPr>
+              <w:t>เทคโนโลยี</w:t>
+            </w:r>
+          </w:p>
+        </w:tc>
+        <w:tc>
+          <w:tcPr>
+            <w:tcW w:type="dxa" w:w="3402"/>
+            <w:shd w:val="clear" w:color="auto" w:fill="1A56DB"/>
+          </w:tcPr>
+          <w:p>
+            <w:pPr>
+              <w:jc w:val="center"/>
+            </w:pPr>
+            <w:r>
+              <w:rPr>
+                <w:b/>
+                <w:color w:val="FFFFFF"/>
+                <w:sz w:val="32"/>
+              </w:rPr>
+              <w:t>หมายเหตุ</w:t>
+            </w:r>
+          </w:p>
+        </w:tc>
+      </w:tr>
+      <w:tr>
+        <w:tc>
+          <w:tcPr>
+            <w:tcW w:type="dxa" w:w="2551"/>
+          </w:tcPr>
+          <w:p>
+            <w:r>
+              <w:rPr>
+                <w:sz w:val="32"/>
+              </w:rPr>
+              <w:t>หน้าเว็บ + ระบบหลัง</w:t>
+            </w:r>
+          </w:p>
+        </w:tc>
+        <w:tc>
+          <w:tcPr>
+            <w:tcW w:type="dxa" w:w="2835"/>
+          </w:tcPr>
+          <w:p>
+            <w:r>
+              <w:rPr>
+                <w:sz w:val="32"/>
+              </w:rPr>
+              <w:t>Next.js 14 (App Router)</w:t>
+            </w:r>
+          </w:p>
+        </w:tc>
+        <w:tc>
+          <w:tcPr>
+            <w:tcW w:type="dxa" w:w="3402"/>
+          </w:tcPr>
+          <w:p>
+            <w:r>
+              <w:rPr>
+                <w:sz w:val="32"/>
+              </w:rPr>
+              <w:t>เฟรมเวิร์กเดียวจัดการทั้งหมด</w:t>
+            </w:r>
+          </w:p>
+        </w:tc>
+      </w:tr>
+      <w:tr>
+        <w:tc>
+          <w:tcPr>
+            <w:tcW w:type="dxa" w:w="2551"/>
+            <w:shd w:val="clear" w:color="auto" w:fill="EBF5FB"/>
+          </w:tcPr>
+          <w:p>
+            <w:r>
+              <w:rPr>
+                <w:sz w:val="32"/>
+              </w:rPr>
+              <w:t>ฐานข้อมูล (พัฒนา)</w:t>
+            </w:r>
+          </w:p>
+        </w:tc>
+        <w:tc>
+          <w:tcPr>
+            <w:tcW w:type="dxa" w:w="2835"/>
+            <w:shd w:val="clear" w:color="auto" w:fill="EBF5FB"/>
+          </w:tcPr>
+          <w:p>
+            <w:r>
+              <w:rPr>
+                <w:sz w:val="32"/>
+              </w:rPr>
+              <w:t>Prisma ORM + SQLite</w:t>
+            </w:r>
+          </w:p>
+        </w:tc>
+        <w:tc>
+          <w:tcPr>
+            <w:tcW w:type="dxa" w:w="3402"/>
+            <w:shd w:val="clear" w:color="auto" w:fill="EBF5FB"/>
+          </w:tcPr>
+          <w:p>
+            <w:r>
+              <w:rPr>
+                <w:sz w:val="32"/>
+              </w:rPr>
+              <w:t>ไม่ต้องติดตั้ง Docker</w:t>
+            </w:r>
+          </w:p>
+        </w:tc>
+      </w:tr>
+      <w:tr>
+        <w:tc>
+          <w:tcPr>
+            <w:tcW w:type="dxa" w:w="2551"/>
+          </w:tcPr>
+          <w:p>
+            <w:r>
+              <w:rPr>
+                <w:sz w:val="32"/>
+              </w:rPr>
+              <w:t>ฐานข้อมูล (ใช้งานจริง)</w:t>
+            </w:r>
+          </w:p>
+        </w:tc>
+        <w:tc>
+          <w:tcPr>
+            <w:tcW w:type="dxa" w:w="2835"/>
+          </w:tcPr>
+          <w:p>
+            <w:r>
+              <w:rPr>
+                <w:sz w:val="32"/>
+              </w:rPr>
+              <w:t>Prisma ORM + PostgreSQL</w:t>
+            </w:r>
+          </w:p>
+        </w:tc>
+        <w:tc>
+          <w:tcPr>
+            <w:tcW w:type="dxa" w:w="3402"/>
+          </w:tcPr>
+          <w:p>
+            <w:r>
+              <w:rPr>
+                <w:sz w:val="32"/>
+              </w:rPr>
+              <w:t>ย้ายง่ายตอน Deploy</w:t>
+            </w:r>
+          </w:p>
+        </w:tc>
+      </w:tr>
+      <w:tr>
+        <w:tc>
+          <w:tcPr>
+            <w:tcW w:type="dxa" w:w="2551"/>
+            <w:shd w:val="clear" w:color="auto" w:fill="EBF5FB"/>
+          </w:tcPr>
+          <w:p>
+            <w:r>
+              <w:rPr>
+                <w:sz w:val="32"/>
+              </w:rPr>
+              <w:t>หน้าตาเว็บ</w:t>
+            </w:r>
+          </w:p>
+        </w:tc>
+        <w:tc>
+          <w:tcPr>
+            <w:tcW w:type="dxa" w:w="2835"/>
+            <w:shd w:val="clear" w:color="auto" w:fill="EBF5FB"/>
+          </w:tcPr>
+          <w:p>
+            <w:r>
+              <w:rPr>
+                <w:sz w:val="32"/>
+              </w:rPr>
+              <w:t>Tailwind CSS</w:t>
+            </w:r>
+          </w:p>
+        </w:tc>
+        <w:tc>
+          <w:tcPr>
+            <w:tcW w:type="dxa" w:w="3402"/>
+            <w:shd w:val="clear" w:color="auto" w:fill="EBF5FB"/>
+          </w:tcPr>
+          <w:p>
+            <w:r>
+              <w:rPr>
+                <w:sz w:val="32"/>
+              </w:rPr>
+              <w:t>ปรับแต่งได้ยืดหยุ่น</w:t>
+            </w:r>
+          </w:p>
+        </w:tc>
+      </w:tr>
+      <w:tr>
+        <w:tc>
+          <w:tcPr>
+            <w:tcW w:type="dxa" w:w="2551"/>
+          </w:tcPr>
+          <w:p>
+            <w:r>
+              <w:rPr>
+                <w:sz w:val="32"/>
+              </w:rPr>
+              <w:t>รูปภาพ</w:t>
+            </w:r>
+          </w:p>
+        </w:tc>
+        <w:tc>
+          <w:tcPr>
+            <w:tcW w:type="dxa" w:w="2835"/>
+          </w:tcPr>
+          <w:p>
+            <w:r>
+              <w:rPr>
+                <w:sz w:val="32"/>
+              </w:rPr>
+              <w:t>Cloudinary / เก็บในเซิร์ฟเวอร์</w:t>
+            </w:r>
+          </w:p>
+        </w:tc>
+        <w:tc>
+          <w:tcPr>
+            <w:tcW w:type="dxa" w:w="3402"/>
+          </w:tcPr>
+          <w:p>
+            <w:r>
+              <w:rPr>
+                <w:sz w:val="32"/>
+              </w:rPr>
+              <w:t>รูปสินค้าและผลงาน</w:t>
+            </w:r>
+          </w:p>
+        </w:tc>
+      </w:tr>
+      <w:tr>
+        <w:tc>
+          <w:tcPr>
+            <w:tcW w:type="dxa" w:w="2551"/>
+            <w:shd w:val="clear" w:color="auto" w:fill="EBF5FB"/>
+          </w:tcPr>
+          <w:p>
+            <w:r>
+              <w:rPr>
+                <w:sz w:val="32"/>
+              </w:rPr>
+              <w:t>ระบบรักษาความปลอดภัย</w:t>
+            </w:r>
+          </w:p>
+        </w:tc>
+        <w:tc>
+          <w:tcPr>
+            <w:tcW w:type="dxa" w:w="2835"/>
+            <w:shd w:val="clear" w:color="auto" w:fill="EBF5FB"/>
+          </w:tcPr>
+          <w:p>
+            <w:r>
+              <w:rPr>
+                <w:sz w:val="32"/>
+              </w:rPr>
+              <w:t>bcryptjs + JWT</w:t>
+            </w:r>
+          </w:p>
+        </w:tc>
+        <w:tc>
+          <w:tcPr>
+            <w:tcW w:type="dxa" w:w="3402"/>
+            <w:shd w:val="clear" w:color="auto" w:fill="EBF5FB"/>
+          </w:tcPr>
+          <w:p>
+            <w:r>
+              <w:rPr>
+                <w:sz w:val="32"/>
+              </w:rPr>
+              <w:t>สำหรับผู้ดูแลระบบ</w:t>
+            </w:r>
+          </w:p>
+        </w:tc>
+      </w:tr>
+      <w:tr>
+        <w:tc>
+          <w:tcPr>
+            <w:tcW w:type="dxa" w:w="2551"/>
+          </w:tcPr>
+          <w:p>
+            <w:r>
+              <w:rPr>
+                <w:sz w:val="32"/>
+              </w:rPr>
+              <w:t>อีเมล</w:t>
+            </w:r>
+          </w:p>
+        </w:tc>
+        <w:tc>
+          <w:tcPr>
+            <w:tcW w:type="dxa" w:w="2835"/>
+          </w:tcPr>
+          <w:p>
+            <w:r>
+              <w:rPr>
+                <w:sz w:val="32"/>
+              </w:rPr>
+              <w:t>Resend / Nodemailer</w:t>
+            </w:r>
+          </w:p>
+        </w:tc>
+        <w:tc>
+          <w:tcPr>
+            <w:tcW w:type="dxa" w:w="3402"/>
+          </w:tcPr>
+          <w:p>
+            <w:r>
+              <w:rPr>
+                <w:sz w:val="32"/>
+              </w:rPr>
+              <w:t>แจ้งเตือนเมื่อมีคำขอ</w:t>
+            </w:r>
+          </w:p>
+        </w:tc>
+      </w:tr>
+      <w:tr>
+        <w:tc>
+          <w:tcPr>
+            <w:tcW w:type="dxa" w:w="2551"/>
+            <w:shd w:val="clear" w:color="auto" w:fill="EBF5FB"/>
+          </w:tcPr>
+          <w:p>
+            <w:r>
+              <w:rPr>
+                <w:sz w:val="32"/>
+              </w:rPr>
+              <w:t>การ Deploy</w:t>
+            </w:r>
+          </w:p>
+        </w:tc>
+        <w:tc>
+          <w:tcPr>
+            <w:tcW w:type="dxa" w:w="2835"/>
+            <w:shd w:val="clear" w:color="auto" w:fill="EBF5FB"/>
+          </w:tcPr>
+          <w:p>
+            <w:r>
+              <w:rPr>
+                <w:sz w:val="32"/>
+              </w:rPr>
+              <w:t>Vercel</w:t>
+            </w:r>
+          </w:p>
+        </w:tc>
+        <w:tc>
+          <w:tcPr>
+            <w:tcW w:type="dxa" w:w="3402"/>
+            <w:shd w:val="clear" w:color="auto" w:fill="EBF5FB"/>
+          </w:tcPr>
+          <w:p>
+            <w:r>
+              <w:rPr>
+                <w:sz w:val="32"/>
+              </w:rPr>
+              <w:t>อัปเดตอัตโนมัติเมื่อ Push</w:t>
+            </w:r>
+          </w:p>
+        </w:tc>
+      </w:tr>
+      <w:tr>
+        <w:tc>
+          <w:tcPr>
+            <w:tcW w:type="dxa" w:w="2551"/>
+          </w:tcPr>
+          <w:p>
+            <w:r>
+              <w:rPr>
+                <w:sz w:val="32"/>
+              </w:rPr>
+              <w:t>ที่เก็บโค้ด</w:t>
+            </w:r>
+          </w:p>
+        </w:tc>
+        <w:tc>
+          <w:tcPr>
+            <w:tcW w:type="dxa" w:w="2835"/>
+          </w:tcPr>
+          <w:p>
+            <w:r>
+              <w:rPr>
+                <w:sz w:val="32"/>
+              </w:rPr>
+              <w:t>github.com/tiw25999/WuLab</w:t>
+            </w:r>
+          </w:p>
+        </w:tc>
+        <w:tc>
+          <w:tcPr>
+            <w:tcW w:type="dxa" w:w="3402"/>
+          </w:tcPr>
+          <w:p>
+            <w:r>
+              <w:rPr>
+                <w:sz w:val="32"/>
+              </w:rPr>
+              <w:t>สาขาหลัก: main</w:t>
+            </w:r>
+          </w:p>
+        </w:tc>
+      </w:tr>
+    </w:tbl>
+    <w:p/>
+    <w:p>
+      <w:pPr>
+        <w:pStyle w:val="Heading1"/>
+      </w:pPr>
+      <w:r>
+        <w:rPr>
+          <w:b/>
+          <w:color w:val="1A56DB"/>
+          <w:sz w:val="44"/>
+        </w:rPr>
+        <w:t>6. แผนการพัฒนาพร้อมระยะเวลา</w:t>
+      </w:r>
+    </w:p>
+    <w:p>
+      <w:pPr>
+        <w:pStyle w:val="Heading2"/>
+      </w:pPr>
+      <w:r>
+        <w:rPr>
+          <w:b/>
+          <w:color w:val="1A56DB"/>
+          <w:sz w:val="38"/>
+        </w:rPr>
+        <w:t>ระยะที่ 1 — เวอร์ชันแรกสำหรับนำเสนอ  (ประมาณ 5–7 วัน)</w:t>
       </w:r>
     </w:p>
     <w:tbl>
@@ -2441,15 +2917,15 @@
               <w:rPr>
                 <w:b/>
                 <w:color w:val="FFFFFF"/>
-                <w:sz w:val="24"/>
+                <w:sz w:val="32"/>
               </w:rPr>
-              <w:t>ส่วน</w:t>
+              <w:t>งาน</w:t>
             </w:r>
           </w:p>
         </w:tc>
         <w:tc>
           <w:tcPr>
-            <w:tcW w:type="dxa" w:w="3118"/>
+            <w:tcW w:type="dxa" w:w="4252"/>
             <w:shd w:val="clear" w:color="auto" w:fill="1A56DB"/>
           </w:tcPr>
           <w:p>
@@ -2460,15 +2936,15 @@
               <w:rPr>
                 <w:b/>
                 <w:color w:val="FFFFFF"/>
-                <w:sz w:val="24"/>
+                <w:sz w:val="32"/>
               </w:rPr>
-              <w:t>เทคโนโลยี</w:t>
+              <w:t>รายละเอียด</w:t>
             </w:r>
           </w:p>
         </w:tc>
         <w:tc>
           <w:tcPr>
-            <w:tcW w:type="dxa" w:w="3402"/>
+            <w:tcW w:type="dxa" w:w="2268"/>
             <w:shd w:val="clear" w:color="auto" w:fill="1A56DB"/>
           </w:tcPr>
           <w:p>
@@ -2479,9 +2955,9 @@
               <w:rPr>
                 <w:b/>
                 <w:color w:val="FFFFFF"/>
-                <w:sz w:val="24"/>
+                <w:sz w:val="32"/>
               </w:rPr>
-              <w:t>หมายเหตุ</w:t>
+              <w:t>เวลาโดยประมาณ</w:t>
             </w:r>
           </w:p>
         </w:tc>
@@ -2494,35 +2970,35 @@
           <w:p>
             <w:r>
               <w:rPr>
-                <w:sz w:val="24"/>
+                <w:sz w:val="32"/>
               </w:rPr>
-              <w:t>หน้าเว็บ + ระบบหลัง</w:t>
+              <w:t>ตั้งค่าโปรเจกต์</w:t>
             </w:r>
           </w:p>
         </w:tc>
         <w:tc>
           <w:tcPr>
-            <w:tcW w:type="dxa" w:w="3118"/>
+            <w:tcW w:type="dxa" w:w="4252"/>
           </w:tcPr>
           <w:p>
             <w:r>
               <w:rPr>
-                <w:sz w:val="24"/>
+                <w:sz w:val="32"/>
               </w:rPr>
-              <w:t>Next.js 14 (App Router)</w:t>
+              <w:t>สร้าง Next.js + เชื่อมต่อฐานข้อมูล + ข้อมูลเริ่มต้น</w:t>
             </w:r>
           </w:p>
         </w:tc>
         <w:tc>
           <w:tcPr>
-            <w:tcW w:type="dxa" w:w="3402"/>
+            <w:tcW w:type="dxa" w:w="2268"/>
           </w:tcPr>
           <w:p>
             <w:r>
               <w:rPr>
-                <w:sz w:val="24"/>
+                <w:sz w:val="32"/>
               </w:rPr>
-              <w:t>เฟรมเวิร์กเดียวจัดการทั้งหมด</w:t>
+              <w:t>ครึ่งวัน</w:t>
             </w:r>
           </w:p>
         </w:tc>
@@ -2536,37 +3012,37 @@
           <w:p>
             <w:r>
               <w:rPr>
-                <w:sz w:val="24"/>
+                <w:sz w:val="32"/>
               </w:rPr>
-              <w:t>ฐานข้อมูล (พัฒนา)</w:t>
+              <w:t>หน้าแรก + เกี่ยวกับเรา</w:t>
             </w:r>
           </w:p>
         </w:tc>
         <w:tc>
           <w:tcPr>
-            <w:tcW w:type="dxa" w:w="3118"/>
+            <w:tcW w:type="dxa" w:w="4252"/>
             <w:shd w:val="clear" w:color="auto" w:fill="EBF5FB"/>
           </w:tcPr>
           <w:p>
             <w:r>
               <w:rPr>
-                <w:sz w:val="24"/>
+                <w:sz w:val="32"/>
               </w:rPr>
-              <w:t>Prisma ORM + SQLite</w:t>
+              <w:t>Hero section จุดเด่น ประวัติบริษัท ใบรับรอง มอก.</w:t>
             </w:r>
           </w:p>
         </w:tc>
         <w:tc>
           <w:tcPr>
-            <w:tcW w:type="dxa" w:w="3402"/>
+            <w:tcW w:type="dxa" w:w="2268"/>
             <w:shd w:val="clear" w:color="auto" w:fill="EBF5FB"/>
           </w:tcPr>
           <w:p>
             <w:r>
               <w:rPr>
-                <w:sz w:val="24"/>
+                <w:sz w:val="32"/>
               </w:rPr>
-              <w:t>ไม่ต้องติดตั้ง Docker</w:t>
+              <w:t>1 วัน</w:t>
             </w:r>
           </w:p>
         </w:tc>
@@ -2579,35 +3055,35 @@
           <w:p>
             <w:r>
               <w:rPr>
-                <w:sz w:val="24"/>
+                <w:sz w:val="32"/>
               </w:rPr>
-              <w:t>ฐานข้อมูล (ใช้งานจริง)</w:t>
+              <w:t>แคตาล็อกสินค้า 3 รายการ</w:t>
             </w:r>
           </w:p>
         </w:tc>
         <w:tc>
           <w:tcPr>
-            <w:tcW w:type="dxa" w:w="3118"/>
+            <w:tcW w:type="dxa" w:w="4252"/>
           </w:tcPr>
           <w:p>
             <w:r>
               <w:rPr>
-                <w:sz w:val="24"/>
+                <w:sz w:val="32"/>
               </w:rPr>
-              <w:t>Prisma ORM + PostgreSQL</w:t>
+              <w:t>รายการสินค้า หน้ารายละเอียด ดาวน์โหลดใบสเปค</w:t>
             </w:r>
           </w:p>
         </w:tc>
         <w:tc>
           <w:tcPr>
-            <w:tcW w:type="dxa" w:w="3402"/>
+            <w:tcW w:type="dxa" w:w="2268"/>
           </w:tcPr>
           <w:p>
             <w:r>
               <w:rPr>
-                <w:sz w:val="24"/>
+                <w:sz w:val="32"/>
               </w:rPr>
-              <w:t>ย้ายง่ายตอน Deploy</w:t>
+              <w:t>1.5 วัน</w:t>
             </w:r>
           </w:p>
         </w:tc>
@@ -2621,37 +3097,37 @@
           <w:p>
             <w:r>
               <w:rPr>
-                <w:sz w:val="24"/>
+                <w:sz w:val="32"/>
               </w:rPr>
-              <w:t>หน้าตาเว็บ</w:t>
+              <w:t>แบบฟอร์มขอใบเสนอราคา</w:t>
             </w:r>
           </w:p>
         </w:tc>
         <w:tc>
           <w:tcPr>
-            <w:tcW w:type="dxa" w:w="3118"/>
+            <w:tcW w:type="dxa" w:w="4252"/>
             <w:shd w:val="clear" w:color="auto" w:fill="EBF5FB"/>
           </w:tcPr>
           <w:p>
             <w:r>
               <w:rPr>
-                <w:sz w:val="24"/>
+                <w:sz w:val="32"/>
               </w:rPr>
-              <w:t>Tailwind CSS</w:t>
+              <w:t>ฟอร์มแยก 3 กลุ่มลูกค้า + แจ้งเตือนอีเมล</w:t>
             </w:r>
           </w:p>
         </w:tc>
         <w:tc>
           <w:tcPr>
-            <w:tcW w:type="dxa" w:w="3402"/>
+            <w:tcW w:type="dxa" w:w="2268"/>
             <w:shd w:val="clear" w:color="auto" w:fill="EBF5FB"/>
           </w:tcPr>
           <w:p>
             <w:r>
               <w:rPr>
-                <w:sz w:val="24"/>
+                <w:sz w:val="32"/>
               </w:rPr>
-              <w:t>ปรับแต่งได้ยืดหยุ่น</w:t>
+              <w:t>1 วัน</w:t>
             </w:r>
           </w:p>
         </w:tc>
@@ -2664,35 +3140,35 @@
           <w:p>
             <w:r>
               <w:rPr>
-                <w:sz w:val="24"/>
+                <w:sz w:val="32"/>
               </w:rPr>
-              <w:t>รูปภาพ</w:t>
+              <w:t>รองรับสองภาษา</w:t>
             </w:r>
           </w:p>
         </w:tc>
         <w:tc>
           <w:tcPr>
-            <w:tcW w:type="dxa" w:w="3118"/>
+            <w:tcW w:type="dxa" w:w="4252"/>
           </w:tcPr>
           <w:p>
             <w:r>
               <w:rPr>
-                <w:sz w:val="24"/>
+                <w:sz w:val="32"/>
               </w:rPr>
-              <w:t>Cloudinary หรือเก็บในเซิร์ฟเวอร์</w:t>
+              <w:t>แปลเนื้อหาทุกหน้าเป็นไทย-อังกฤษ</w:t>
             </w:r>
           </w:p>
         </w:tc>
         <w:tc>
           <w:tcPr>
-            <w:tcW w:type="dxa" w:w="3402"/>
+            <w:tcW w:type="dxa" w:w="2268"/>
           </w:tcPr>
           <w:p>
             <w:r>
               <w:rPr>
-                <w:sz w:val="24"/>
+                <w:sz w:val="32"/>
               </w:rPr>
-              <w:t>รูปสินค้าและผลงาน</w:t>
+              <w:t>1 วัน</w:t>
             </w:r>
           </w:p>
         </w:tc>
@@ -2706,37 +3182,122 @@
           <w:p>
             <w:r>
               <w:rPr>
-                <w:sz w:val="24"/>
+                <w:sz w:val="32"/>
               </w:rPr>
-              <w:t>ระบบรักษาความปลอดภัย</w:t>
+              <w:t>ทดสอบและ Deploy</w:t>
             </w:r>
           </w:p>
         </w:tc>
         <w:tc>
           <w:tcPr>
-            <w:tcW w:type="dxa" w:w="3118"/>
+            <w:tcW w:type="dxa" w:w="4252"/>
             <w:shd w:val="clear" w:color="auto" w:fill="EBF5FB"/>
           </w:tcPr>
           <w:p>
             <w:r>
               <w:rPr>
-                <w:sz w:val="24"/>
+                <w:sz w:val="32"/>
               </w:rPr>
-              <w:t>bcryptjs + JWT</w:t>
+              <w:t>ทดสอบครบทุกหน้า + ขึ้น Vercel</w:t>
             </w:r>
           </w:p>
         </w:tc>
         <w:tc>
           <w:tcPr>
-            <w:tcW w:type="dxa" w:w="3402"/>
+            <w:tcW w:type="dxa" w:w="2268"/>
             <w:shd w:val="clear" w:color="auto" w:fill="EBF5FB"/>
           </w:tcPr>
           <w:p>
             <w:r>
               <w:rPr>
-                <w:sz w:val="24"/>
+                <w:sz w:val="32"/>
               </w:rPr>
-              <w:t>สำหรับผู้ดูแลระบบ</w:t>
+              <w:t>ครึ่งวัน</w:t>
+            </w:r>
+          </w:p>
+        </w:tc>
+      </w:tr>
+    </w:tbl>
+    <w:p/>
+    <w:p>
+      <w:pPr>
+        <w:pStyle w:val="Heading2"/>
+      </w:pPr>
+      <w:r>
+        <w:rPr>
+          <w:b/>
+          <w:color w:val="1A56DB"/>
+          <w:sz w:val="38"/>
+        </w:rPr>
+        <w:t>ระยะที่ 2 — ระบบขาย  (ประมาณ 10–14 วัน)</w:t>
+      </w:r>
+    </w:p>
+    <w:tbl>
+      <w:tblPr>
+        <w:tblStyle w:val="TableGrid"/>
+        <w:tblW w:type="auto" w:w="0"/>
+        <w:tblLook w:firstColumn="1" w:firstRow="1" w:lastColumn="0" w:lastRow="0" w:noHBand="0" w:noVBand="1" w:val="04A0"/>
+      </w:tblPr>
+      <w:tblGrid>
+        <w:gridCol w:w="3041"/>
+        <w:gridCol w:w="3041"/>
+        <w:gridCol w:w="3041"/>
+      </w:tblGrid>
+      <w:tr>
+        <w:tc>
+          <w:tcPr>
+            <w:tcW w:type="dxa" w:w="2268"/>
+            <w:shd w:val="clear" w:color="auto" w:fill="1A56DB"/>
+          </w:tcPr>
+          <w:p>
+            <w:pPr>
+              <w:jc w:val="center"/>
+            </w:pPr>
+            <w:r>
+              <w:rPr>
+                <w:b/>
+                <w:color w:val="FFFFFF"/>
+                <w:sz w:val="32"/>
+              </w:rPr>
+              <w:t>งาน</w:t>
+            </w:r>
+          </w:p>
+        </w:tc>
+        <w:tc>
+          <w:tcPr>
+            <w:tcW w:type="dxa" w:w="4252"/>
+            <w:shd w:val="clear" w:color="auto" w:fill="1A56DB"/>
+          </w:tcPr>
+          <w:p>
+            <w:pPr>
+              <w:jc w:val="center"/>
+            </w:pPr>
+            <w:r>
+              <w:rPr>
+                <w:b/>
+                <w:color w:val="FFFFFF"/>
+                <w:sz w:val="32"/>
+              </w:rPr>
+              <w:t>รายละเอียด</w:t>
+            </w:r>
+          </w:p>
+        </w:tc>
+        <w:tc>
+          <w:tcPr>
+            <w:tcW w:type="dxa" w:w="2268"/>
+            <w:shd w:val="clear" w:color="auto" w:fill="1A56DB"/>
+          </w:tcPr>
+          <w:p>
+            <w:pPr>
+              <w:jc w:val="center"/>
+            </w:pPr>
+            <w:r>
+              <w:rPr>
+                <w:b/>
+                <w:color w:val="FFFFFF"/>
+                <w:sz w:val="32"/>
+              </w:rPr>
+              <w:t>เวลาโดยประมาณ</w:t>
             </w:r>
           </w:p>
         </w:tc>
@@ -2749,35 +3310,35 @@
           <w:p>
             <w:r>
               <w:rPr>
-                <w:sz w:val="24"/>
+                <w:sz w:val="32"/>
               </w:rPr>
-              <w:t>อีเมล</w:t>
+              <w:t>หน้าจัดการผู้ดูแล</w:t>
             </w:r>
           </w:p>
         </w:tc>
         <w:tc>
           <w:tcPr>
-            <w:tcW w:type="dxa" w:w="3118"/>
+            <w:tcW w:type="dxa" w:w="4252"/>
           </w:tcPr>
           <w:p>
             <w:r>
               <w:rPr>
-                <w:sz w:val="24"/>
+                <w:sz w:val="32"/>
               </w:rPr>
-              <w:t>Resend หรือ Nodemailer</w:t>
+              <w:t>เข้าสู่ระบบ ดูคำขอ เปลี่ยนสถานะ</w:t>
             </w:r>
           </w:p>
         </w:tc>
         <w:tc>
           <w:tcPr>
-            <w:tcW w:type="dxa" w:w="3402"/>
+            <w:tcW w:type="dxa" w:w="2268"/>
           </w:tcPr>
           <w:p>
             <w:r>
               <w:rPr>
-                <w:sz w:val="24"/>
+                <w:sz w:val="32"/>
               </w:rPr>
-              <w:t>แจ้งเตือนเมื่อมีคำขอ</w:t>
+              <w:t>2 วัน</w:t>
             </w:r>
           </w:p>
         </w:tc>
@@ -2791,37 +3352,37 @@
           <w:p>
             <w:r>
               <w:rPr>
-                <w:sz w:val="24"/>
+                <w:sz w:val="32"/>
               </w:rPr>
-              <w:t>การ Deploy</w:t>
+              <w:t>จัดการสินค้าผ่าน Admin</w:t>
             </w:r>
           </w:p>
         </w:tc>
         <w:tc>
           <w:tcPr>
-            <w:tcW w:type="dxa" w:w="3118"/>
+            <w:tcW w:type="dxa" w:w="4252"/>
             <w:shd w:val="clear" w:color="auto" w:fill="EBF5FB"/>
           </w:tcPr>
           <w:p>
             <w:r>
               <w:rPr>
-                <w:sz w:val="24"/>
+                <w:sz w:val="32"/>
               </w:rPr>
-              <w:t>Vercel</w:t>
+              <w:t>เพิ่ม แก้ไข ลบสินค้า อัปโหลดรูปและใบสเปค</w:t>
             </w:r>
           </w:p>
         </w:tc>
         <w:tc>
           <w:tcPr>
-            <w:tcW w:type="dxa" w:w="3402"/>
+            <w:tcW w:type="dxa" w:w="2268"/>
             <w:shd w:val="clear" w:color="auto" w:fill="EBF5FB"/>
           </w:tcPr>
           <w:p>
             <w:r>
               <w:rPr>
-                <w:sz w:val="24"/>
+                <w:sz w:val="32"/>
               </w:rPr>
-              <w:t>อัปเดตอัตโนมัติเมื่อ Push</w:t>
+              <w:t>2 วัน</w:t>
             </w:r>
           </w:p>
         </w:tc>
@@ -2834,35 +3395,419 @@
           <w:p>
             <w:r>
               <w:rPr>
-                <w:sz w:val="24"/>
+                <w:sz w:val="32"/>
               </w:rPr>
-              <w:t>ที่เก็บโค้ด</w:t>
+              <w:t>ติดตามสถานะคำขอ</w:t>
             </w:r>
           </w:p>
         </w:tc>
         <w:tc>
           <w:tcPr>
-            <w:tcW w:type="dxa" w:w="3118"/>
+            <w:tcW w:type="dxa" w:w="4252"/>
           </w:tcPr>
           <w:p>
             <w:r>
               <w:rPr>
-                <w:sz w:val="24"/>
+                <w:sz w:val="32"/>
               </w:rPr>
-              <w:t>github.com/tiw25999/WuLab</w:t>
+              <w:t>ลูกค้าตรวจสอบสถานะด้วยรหัสอ้างอิง</w:t>
             </w:r>
           </w:p>
         </w:tc>
         <w:tc>
           <w:tcPr>
-            <w:tcW w:type="dxa" w:w="3402"/>
+            <w:tcW w:type="dxa" w:w="2268"/>
           </w:tcPr>
           <w:p>
             <w:r>
               <w:rPr>
-                <w:sz w:val="24"/>
+                <w:sz w:val="32"/>
               </w:rPr>
-              <w:t>สาขาหลัก: main</w:t>
+              <w:t>1 วัน</w:t>
+            </w:r>
+          </w:p>
+        </w:tc>
+      </w:tr>
+      <w:tr>
+        <w:tc>
+          <w:tcPr>
+            <w:tcW w:type="dxa" w:w="2268"/>
+            <w:shd w:val="clear" w:color="auto" w:fill="EBF5FB"/>
+          </w:tcPr>
+          <w:p>
+            <w:r>
+              <w:rPr>
+                <w:sz w:val="32"/>
+              </w:rPr>
+              <w:t>หน้าผลงานอ้างอิง</w:t>
+            </w:r>
+          </w:p>
+        </w:tc>
+        <w:tc>
+          <w:tcPr>
+            <w:tcW w:type="dxa" w:w="4252"/>
+            <w:shd w:val="clear" w:color="auto" w:fill="EBF5FB"/>
+          </w:tcPr>
+          <w:p>
+            <w:r>
+              <w:rPr>
+                <w:sz w:val="32"/>
+              </w:rPr>
+              <w:t>Portfolio แยกตามประเภทงาน</w:t>
+            </w:r>
+          </w:p>
+        </w:tc>
+        <w:tc>
+          <w:tcPr>
+            <w:tcW w:type="dxa" w:w="2268"/>
+            <w:shd w:val="clear" w:color="auto" w:fill="EBF5FB"/>
+          </w:tcPr>
+          <w:p>
+            <w:r>
+              <w:rPr>
+                <w:sz w:val="32"/>
+              </w:rPr>
+              <w:t>2 วัน</w:t>
+            </w:r>
+          </w:p>
+        </w:tc>
+      </w:tr>
+      <w:tr>
+        <w:tc>
+          <w:tcPr>
+            <w:tcW w:type="dxa" w:w="2268"/>
+          </w:tcPr>
+          <w:p>
+            <w:r>
+              <w:rPr>
+                <w:sz w:val="32"/>
+              </w:rPr>
+              <w:t>ส่งออกรายงาน Excel</w:t>
+            </w:r>
+          </w:p>
+        </w:tc>
+        <w:tc>
+          <w:tcPr>
+            <w:tcW w:type="dxa" w:w="4252"/>
+          </w:tcPr>
+          <w:p>
+            <w:r>
+              <w:rPr>
+                <w:sz w:val="32"/>
+              </w:rPr>
+              <w:t>ดาวน์โหลดรายการคำขอเป็นไฟล์ Excel</w:t>
+            </w:r>
+          </w:p>
+        </w:tc>
+        <w:tc>
+          <w:tcPr>
+            <w:tcW w:type="dxa" w:w="2268"/>
+          </w:tcPr>
+          <w:p>
+            <w:r>
+              <w:rPr>
+                <w:sz w:val="32"/>
+              </w:rPr>
+              <w:t>1 วัน</w:t>
+            </w:r>
+          </w:p>
+        </w:tc>
+      </w:tr>
+      <w:tr>
+        <w:tc>
+          <w:tcPr>
+            <w:tcW w:type="dxa" w:w="2268"/>
+            <w:shd w:val="clear" w:color="auto" w:fill="EBF5FB"/>
+          </w:tcPr>
+          <w:p>
+            <w:r>
+              <w:rPr>
+                <w:sz w:val="32"/>
+              </w:rPr>
+              <w:t>ทดสอบและปรับปรุง</w:t>
+            </w:r>
+          </w:p>
+        </w:tc>
+        <w:tc>
+          <w:tcPr>
+            <w:tcW w:type="dxa" w:w="4252"/>
+            <w:shd w:val="clear" w:color="auto" w:fill="EBF5FB"/>
+          </w:tcPr>
+          <w:p>
+            <w:r>
+              <w:rPr>
+                <w:sz w:val="32"/>
+              </w:rPr>
+              <w:t>ทดสอบครบทุกฟีเจอร์ + แก้ไขข้อผิดพลาด</w:t>
+            </w:r>
+          </w:p>
+        </w:tc>
+        <w:tc>
+          <w:tcPr>
+            <w:tcW w:type="dxa" w:w="2268"/>
+            <w:shd w:val="clear" w:color="auto" w:fill="EBF5FB"/>
+          </w:tcPr>
+          <w:p>
+            <w:r>
+              <w:rPr>
+                <w:sz w:val="32"/>
+              </w:rPr>
+              <w:t>2–4 วัน</w:t>
+            </w:r>
+          </w:p>
+        </w:tc>
+      </w:tr>
+    </w:tbl>
+    <w:p/>
+    <w:p>
+      <w:pPr>
+        <w:pStyle w:val="Heading2"/>
+      </w:pPr>
+      <w:r>
+        <w:rPr>
+          <w:b/>
+          <w:color w:val="1A56DB"/>
+          <w:sz w:val="38"/>
+        </w:rPr>
+        <w:t>ระยะที่ 3 — พื้นที่สำหรับลูกค้า  (ประมาณ 7–10 วัน)</w:t>
+      </w:r>
+    </w:p>
+    <w:tbl>
+      <w:tblPr>
+        <w:tblStyle w:val="TableGrid"/>
+        <w:tblW w:type="auto" w:w="0"/>
+        <w:tblLook w:firstColumn="1" w:firstRow="1" w:lastColumn="0" w:lastRow="0" w:noHBand="0" w:noVBand="1" w:val="04A0"/>
+      </w:tblPr>
+      <w:tblGrid>
+        <w:gridCol w:w="3041"/>
+        <w:gridCol w:w="3041"/>
+        <w:gridCol w:w="3041"/>
+      </w:tblGrid>
+      <w:tr>
+        <w:tc>
+          <w:tcPr>
+            <w:tcW w:type="dxa" w:w="2268"/>
+            <w:shd w:val="clear" w:color="auto" w:fill="1A56DB"/>
+          </w:tcPr>
+          <w:p>
+            <w:pPr>
+              <w:jc w:val="center"/>
+            </w:pPr>
+            <w:r>
+              <w:rPr>
+                <w:b/>
+                <w:color w:val="FFFFFF"/>
+                <w:sz w:val="32"/>
+              </w:rPr>
+              <w:t>งาน</w:t>
+            </w:r>
+          </w:p>
+        </w:tc>
+        <w:tc>
+          <w:tcPr>
+            <w:tcW w:type="dxa" w:w="4252"/>
+            <w:shd w:val="clear" w:color="auto" w:fill="1A56DB"/>
+          </w:tcPr>
+          <w:p>
+            <w:pPr>
+              <w:jc w:val="center"/>
+            </w:pPr>
+            <w:r>
+              <w:rPr>
+                <w:b/>
+                <w:color w:val="FFFFFF"/>
+                <w:sz w:val="32"/>
+              </w:rPr>
+              <w:t>รายละเอียด</w:t>
+            </w:r>
+          </w:p>
+        </w:tc>
+        <w:tc>
+          <w:tcPr>
+            <w:tcW w:type="dxa" w:w="2268"/>
+            <w:shd w:val="clear" w:color="auto" w:fill="1A56DB"/>
+          </w:tcPr>
+          <w:p>
+            <w:pPr>
+              <w:jc w:val="center"/>
+            </w:pPr>
+            <w:r>
+              <w:rPr>
+                <w:b/>
+                <w:color w:val="FFFFFF"/>
+                <w:sz w:val="32"/>
+              </w:rPr>
+              <w:t>เวลาโดยประมาณ</w:t>
+            </w:r>
+          </w:p>
+        </w:tc>
+      </w:tr>
+      <w:tr>
+        <w:tc>
+          <w:tcPr>
+            <w:tcW w:type="dxa" w:w="2268"/>
+          </w:tcPr>
+          <w:p>
+            <w:r>
+              <w:rPr>
+                <w:sz w:val="32"/>
+              </w:rPr>
+              <w:t>ระบบสมาชิกลูกค้าเอกชน</w:t>
+            </w:r>
+          </w:p>
+        </w:tc>
+        <w:tc>
+          <w:tcPr>
+            <w:tcW w:type="dxa" w:w="4252"/>
+          </w:tcPr>
+          <w:p>
+            <w:r>
+              <w:rPr>
+                <w:sz w:val="32"/>
+              </w:rPr>
+              <w:t>สมัครสมาชิก เข้าสู่ระบบ จัดการบัญชี</w:t>
+            </w:r>
+          </w:p>
+        </w:tc>
+        <w:tc>
+          <w:tcPr>
+            <w:tcW w:type="dxa" w:w="2268"/>
+          </w:tcPr>
+          <w:p>
+            <w:r>
+              <w:rPr>
+                <w:sz w:val="32"/>
+              </w:rPr>
+              <w:t>2 วัน</w:t>
+            </w:r>
+          </w:p>
+        </w:tc>
+      </w:tr>
+      <w:tr>
+        <w:tc>
+          <w:tcPr>
+            <w:tcW w:type="dxa" w:w="2268"/>
+            <w:shd w:val="clear" w:color="auto" w:fill="EBF5FB"/>
+          </w:tcPr>
+          <w:p>
+            <w:r>
+              <w:rPr>
+                <w:sz w:val="32"/>
+              </w:rPr>
+              <w:t>ประวัติคำขอและคำสั่งซื้อ</w:t>
+            </w:r>
+          </w:p>
+        </w:tc>
+        <w:tc>
+          <w:tcPr>
+            <w:tcW w:type="dxa" w:w="4252"/>
+            <w:shd w:val="clear" w:color="auto" w:fill="EBF5FB"/>
+          </w:tcPr>
+          <w:p>
+            <w:r>
+              <w:rPr>
+                <w:sz w:val="32"/>
+              </w:rPr>
+              <w:t>ดูรายการที่เคยส่ง พร้อมสถานะ</w:t>
+            </w:r>
+          </w:p>
+        </w:tc>
+        <w:tc>
+          <w:tcPr>
+            <w:tcW w:type="dxa" w:w="2268"/>
+            <w:shd w:val="clear" w:color="auto" w:fill="EBF5FB"/>
+          </w:tcPr>
+          <w:p>
+            <w:r>
+              <w:rPr>
+                <w:sz w:val="32"/>
+              </w:rPr>
+              <w:t>2 วัน</w:t>
+            </w:r>
+          </w:p>
+        </w:tc>
+      </w:tr>
+      <w:tr>
+        <w:tc>
+          <w:tcPr>
+            <w:tcW w:type="dxa" w:w="2268"/>
+          </w:tcPr>
+          <w:p>
+            <w:r>
+              <w:rPr>
+                <w:sz w:val="32"/>
+              </w:rPr>
+              <w:t>เอกสารลูกค้าภาครัฐ</w:t>
+            </w:r>
+          </w:p>
+        </w:tc>
+        <w:tc>
+          <w:tcPr>
+            <w:tcW w:type="dxa" w:w="4252"/>
+          </w:tcPr>
+          <w:p>
+            <w:r>
+              <w:rPr>
+                <w:sz w:val="32"/>
+              </w:rPr>
+              <w:t>ข้อมูลและเอกสารประกอบการจัดซื้อจัดจ้าง</w:t>
+            </w:r>
+          </w:p>
+        </w:tc>
+        <w:tc>
+          <w:tcPr>
+            <w:tcW w:type="dxa" w:w="2268"/>
+          </w:tcPr>
+          <w:p>
+            <w:r>
+              <w:rPr>
+                <w:sz w:val="32"/>
+              </w:rPr>
+              <w:t>2 วัน</w:t>
+            </w:r>
+          </w:p>
+        </w:tc>
+      </w:tr>
+      <w:tr>
+        <w:tc>
+          <w:tcPr>
+            <w:tcW w:type="dxa" w:w="2268"/>
+            <w:shd w:val="clear" w:color="auto" w:fill="EBF5FB"/>
+          </w:tcPr>
+          <w:p>
+            <w:r>
+              <w:rPr>
+                <w:sz w:val="32"/>
+              </w:rPr>
+              <w:t>ทดสอบและ Deploy</w:t>
+            </w:r>
+          </w:p>
+        </w:tc>
+        <w:tc>
+          <w:tcPr>
+            <w:tcW w:type="dxa" w:w="4252"/>
+            <w:shd w:val="clear" w:color="auto" w:fill="EBF5FB"/>
+          </w:tcPr>
+          <w:p>
+            <w:r>
+              <w:rPr>
+                <w:sz w:val="32"/>
+              </w:rPr>
+              <w:t>ทดสอบระบบทั้งหมด + ขึ้น Production</w:t>
+            </w:r>
+          </w:p>
+        </w:tc>
+        <w:tc>
+          <w:tcPr>
+            <w:tcW w:type="dxa" w:w="2268"/>
+            <w:shd w:val="clear" w:color="auto" w:fill="EBF5FB"/>
+          </w:tcPr>
+          <w:p>
+            <w:r>
+              <w:rPr>
+                <w:sz w:val="32"/>
+              </w:rPr>
+              <w:t>1–4 วัน</w:t>
             </w:r>
           </w:p>
         </w:tc>
@@ -2877,206 +3822,519 @@
         <w:rPr>
           <w:b/>
           <w:color w:val="1A56DB"/>
-          <w:sz w:val="36"/>
+          <w:sz w:val="44"/>
         </w:rPr>
-        <w:t>6. แผนการพัฒนา</w:t>
+        <w:t>7. แผน MVP ภายใน 1 วัน (8 ชั่วโมง)</w:t>
+      </w:r>
+    </w:p>
+    <w:p>
+      <w:r>
+        <w:rPr>
+          <w:i/>
+          <w:sz w:val="34"/>
+        </w:rPr>
+        <w:t>เป้าหมาย: เว็บไซต์ที่ใช้งานได้จริง นำเสนอสินค้าได้ และรับคำขอใบเสนอราคาได้ ภายในวันเดียว เหมาะสำหรับการ Pitch หรือ Demo</w:t>
+      </w:r>
+    </w:p>
+    <w:p/>
+    <w:tbl>
+      <w:tblPr>
+        <w:tblStyle w:val="TableGrid"/>
+        <w:tblW w:type="auto" w:w="0"/>
+        <w:tblLook w:firstColumn="1" w:firstRow="1" w:lastColumn="0" w:lastRow="0" w:noHBand="0" w:noVBand="1" w:val="04A0"/>
+      </w:tblPr>
+      <w:tblGrid>
+        <w:gridCol w:w="3041"/>
+        <w:gridCol w:w="3041"/>
+        <w:gridCol w:w="3041"/>
+      </w:tblGrid>
+      <w:tr>
+        <w:tc>
+          <w:tcPr>
+            <w:tcW w:type="dxa" w:w="1984"/>
+            <w:shd w:val="clear" w:color="auto" w:fill="1A56DB"/>
+          </w:tcPr>
+          <w:p>
+            <w:pPr>
+              <w:jc w:val="center"/>
+            </w:pPr>
+            <w:r>
+              <w:rPr>
+                <w:b/>
+                <w:color w:val="FFFFFF"/>
+                <w:sz w:val="32"/>
+              </w:rPr>
+              <w:t>ช่วงเวลา</w:t>
+            </w:r>
+          </w:p>
+        </w:tc>
+        <w:tc>
+          <w:tcPr>
+            <w:tcW w:type="dxa" w:w="4535"/>
+            <w:shd w:val="clear" w:color="auto" w:fill="1A56DB"/>
+          </w:tcPr>
+          <w:p>
+            <w:pPr>
+              <w:jc w:val="center"/>
+            </w:pPr>
+            <w:r>
+              <w:rPr>
+                <w:b/>
+                <w:color w:val="FFFFFF"/>
+                <w:sz w:val="32"/>
+              </w:rPr>
+              <w:t>งาน</w:t>
+            </w:r>
+          </w:p>
+        </w:tc>
+        <w:tc>
+          <w:tcPr>
+            <w:tcW w:type="dxa" w:w="2268"/>
+            <w:shd w:val="clear" w:color="auto" w:fill="1A56DB"/>
+          </w:tcPr>
+          <w:p>
+            <w:pPr>
+              <w:jc w:val="center"/>
+            </w:pPr>
+            <w:r>
+              <w:rPr>
+                <w:b/>
+                <w:color w:val="FFFFFF"/>
+                <w:sz w:val="32"/>
+              </w:rPr>
+              <w:t>สิ่งที่ได้เมื่อเสร็จ</w:t>
+            </w:r>
+          </w:p>
+        </w:tc>
+      </w:tr>
+      <w:tr>
+        <w:tc>
+          <w:tcPr>
+            <w:tcW w:type="dxa" w:w="1984"/>
+          </w:tcPr>
+          <w:p>
+            <w:r>
+              <w:rPr>
+                <w:sz w:val="32"/>
+              </w:rPr>
+              <w:t>08:00 – 09:00</w:t>
+              <w:br/>
+              <w:t>(1 ชั่วโมง)</w:t>
+            </w:r>
+          </w:p>
+        </w:tc>
+        <w:tc>
+          <w:tcPr>
+            <w:tcW w:type="dxa" w:w="4535"/>
+          </w:tcPr>
+          <w:p>
+            <w:r>
+              <w:rPr>
+                <w:sz w:val="32"/>
+              </w:rPr>
+              <w:t>ตั้งค่าโปรเจกต์</w:t>
+              <w:br/>
+              <w:t>• สร้าง Next.js 14 + Tailwind</w:t>
+              <w:br/>
+              <w:t>• เชื่อมต่อ Prisma + SQLite</w:t>
+              <w:br/>
+              <w:t>• ใส่ข้อมูลสินค้า 3 รายการเริ่มต้น</w:t>
+            </w:r>
+          </w:p>
+        </w:tc>
+        <w:tc>
+          <w:tcPr>
+            <w:tcW w:type="dxa" w:w="2268"/>
+          </w:tcPr>
+          <w:p>
+            <w:r>
+              <w:rPr>
+                <w:sz w:val="32"/>
+              </w:rPr>
+              <w:t>โปรเจกต์พร้อมรันในเครื่อง</w:t>
+            </w:r>
+          </w:p>
+        </w:tc>
+      </w:tr>
+      <w:tr>
+        <w:tc>
+          <w:tcPr>
+            <w:tcW w:type="dxa" w:w="1984"/>
+            <w:shd w:val="clear" w:color="auto" w:fill="EBF5FB"/>
+          </w:tcPr>
+          <w:p>
+            <w:r>
+              <w:rPr>
+                <w:sz w:val="32"/>
+              </w:rPr>
+              <w:t>09:00 – 11:00</w:t>
+              <w:br/>
+              <w:t>(2 ชั่วโมง)</w:t>
+            </w:r>
+          </w:p>
+        </w:tc>
+        <w:tc>
+          <w:tcPr>
+            <w:tcW w:type="dxa" w:w="4535"/>
+            <w:shd w:val="clear" w:color="auto" w:fill="EBF5FB"/>
+          </w:tcPr>
+          <w:p>
+            <w:r>
+              <w:rPr>
+                <w:sz w:val="32"/>
+              </w:rPr>
+              <w:t>หน้าแรก + เกี่ยวกับเรา</w:t>
+              <w:br/>
+              <w:t>• Hero: โลโก้ ชื่อบริษัท สโลแกน ปุ่มขอใบเสนอราคา</w:t>
+              <w:br/>
+              <w:t>• จุดเด่น 4 ข้อ + ใบรับรอง มอก.</w:t>
+              <w:br/>
+              <w:t>• ประวัติบริษัท 30 ปี</w:t>
+            </w:r>
+          </w:p>
+        </w:tc>
+        <w:tc>
+          <w:tcPr>
+            <w:tcW w:type="dxa" w:w="2268"/>
+            <w:shd w:val="clear" w:color="auto" w:fill="EBF5FB"/>
+          </w:tcPr>
+          <w:p>
+            <w:r>
+              <w:rPr>
+                <w:sz w:val="32"/>
+              </w:rPr>
+              <w:t>หน้าแรกและหน้าเกี่ยวกับเราสมบูรณ์</w:t>
+            </w:r>
+          </w:p>
+        </w:tc>
+      </w:tr>
+      <w:tr>
+        <w:tc>
+          <w:tcPr>
+            <w:tcW w:type="dxa" w:w="1984"/>
+          </w:tcPr>
+          <w:p>
+            <w:r>
+              <w:rPr>
+                <w:sz w:val="32"/>
+              </w:rPr>
+              <w:t>11:00 – 13:00</w:t>
+              <w:br/>
+              <w:t>(2 ชั่วโมง)</w:t>
+            </w:r>
+          </w:p>
+        </w:tc>
+        <w:tc>
+          <w:tcPr>
+            <w:tcW w:type="dxa" w:w="4535"/>
+          </w:tcPr>
+          <w:p>
+            <w:r>
+              <w:rPr>
+                <w:sz w:val="32"/>
+              </w:rPr>
+              <w:t>แคตาล็อกสินค้า</w:t>
+              <w:br/>
+              <w:t>• หน้ารายการสินค้าทั้ง 3 รายการ + รูปภาพจริง</w:t>
+              <w:br/>
+              <w:t>• หน้ารายละเอียดสินค้าแต่ละรายการ + สเปค</w:t>
+              <w:br/>
+              <w:t>• ปุ่มดาวน์โหลดใบสเปค (PDF)</w:t>
+            </w:r>
+          </w:p>
+        </w:tc>
+        <w:tc>
+          <w:tcPr>
+            <w:tcW w:type="dxa" w:w="2268"/>
+          </w:tcPr>
+          <w:p>
+            <w:r>
+              <w:rPr>
+                <w:sz w:val="32"/>
+              </w:rPr>
+              <w:t>แสดงสินค้าได้ครบทุกรายการ</w:t>
+            </w:r>
+          </w:p>
+        </w:tc>
+      </w:tr>
+      <w:tr>
+        <w:tc>
+          <w:tcPr>
+            <w:tcW w:type="dxa" w:w="1984"/>
+            <w:shd w:val="clear" w:color="auto" w:fill="EBF5FB"/>
+          </w:tcPr>
+          <w:p>
+            <w:r>
+              <w:rPr>
+                <w:sz w:val="32"/>
+              </w:rPr>
+              <w:t>13:00 – 14:00</w:t>
+              <w:br/>
+              <w:t>(พักกลางวัน)</w:t>
+            </w:r>
+          </w:p>
+        </w:tc>
+        <w:tc>
+          <w:tcPr>
+            <w:tcW w:type="dxa" w:w="4535"/>
+            <w:shd w:val="clear" w:color="auto" w:fill="EBF5FB"/>
+          </w:tcPr>
+          <w:p>
+            <w:r>
+              <w:rPr>
+                <w:sz w:val="32"/>
+              </w:rPr>
+              <w:t>— พักกลางวัน —</w:t>
+            </w:r>
+          </w:p>
+        </w:tc>
+        <w:tc>
+          <w:tcPr>
+            <w:tcW w:type="dxa" w:w="2268"/>
+            <w:shd w:val="clear" w:color="auto" w:fill="EBF5FB"/>
+          </w:tcPr>
+          <w:p>
+            <w:r>
+              <w:rPr>
+                <w:sz w:val="32"/>
+              </w:rPr>
+              <w:t>—</w:t>
+            </w:r>
+          </w:p>
+        </w:tc>
+      </w:tr>
+      <w:tr>
+        <w:tc>
+          <w:tcPr>
+            <w:tcW w:type="dxa" w:w="1984"/>
+          </w:tcPr>
+          <w:p>
+            <w:r>
+              <w:rPr>
+                <w:sz w:val="32"/>
+              </w:rPr>
+              <w:t>14:00 – 16:00</w:t>
+              <w:br/>
+              <w:t>(2 ชั่วโมง)</w:t>
+            </w:r>
+          </w:p>
+        </w:tc>
+        <w:tc>
+          <w:tcPr>
+            <w:tcW w:type="dxa" w:w="4535"/>
+          </w:tcPr>
+          <w:p>
+            <w:r>
+              <w:rPr>
+                <w:sz w:val="32"/>
+              </w:rPr>
+              <w:t>ฟอร์มขอใบเสนอราคา</w:t>
+              <w:br/>
+              <w:t>• ฟอร์มแยก 3 กลุ่มลูกค้า (เลือกประเภทแล้วฟอร์มเปลี่ยน)</w:t>
+              <w:br/>
+              <w:t>• บันทึกคำขอลงฐานข้อมูล</w:t>
+              <w:br/>
+              <w:t>• แจ้งเตือนอีเมลไปยังผู้ดูแลระบบ</w:t>
+              <w:br/>
+              <w:t>• หน้ายืนยันพร้อมรหัสอ้างอิง</w:t>
+            </w:r>
+          </w:p>
+        </w:tc>
+        <w:tc>
+          <w:tcPr>
+            <w:tcW w:type="dxa" w:w="2268"/>
+          </w:tcPr>
+          <w:p>
+            <w:r>
+              <w:rPr>
+                <w:sz w:val="32"/>
+              </w:rPr>
+              <w:t>รับคำขอใบเสนอราคาได้จริง</w:t>
+            </w:r>
+          </w:p>
+        </w:tc>
+      </w:tr>
+      <w:tr>
+        <w:tc>
+          <w:tcPr>
+            <w:tcW w:type="dxa" w:w="1984"/>
+            <w:shd w:val="clear" w:color="auto" w:fill="EBF5FB"/>
+          </w:tcPr>
+          <w:p>
+            <w:r>
+              <w:rPr>
+                <w:sz w:val="32"/>
+              </w:rPr>
+              <w:t>16:00 – 17:00</w:t>
+              <w:br/>
+              <w:t>(1 ชั่วโมง)</w:t>
+            </w:r>
+          </w:p>
+        </w:tc>
+        <w:tc>
+          <w:tcPr>
+            <w:tcW w:type="dxa" w:w="4535"/>
+            <w:shd w:val="clear" w:color="auto" w:fill="EBF5FB"/>
+          </w:tcPr>
+          <w:p>
+            <w:r>
+              <w:rPr>
+                <w:sz w:val="32"/>
+              </w:rPr>
+              <w:t>ทดสอบ + Deploy</w:t>
+              <w:br/>
+              <w:t>• ทดสอบทุกหน้าในมือถือและคอมพิวเตอร์</w:t>
+              <w:br/>
+              <w:t>• Push ขึ้น GitHub</w:t>
+              <w:br/>
+              <w:t>• Deploy บน Vercel ได้ลิงก์จริง</w:t>
+            </w:r>
+          </w:p>
+        </w:tc>
+        <w:tc>
+          <w:tcPr>
+            <w:tcW w:type="dxa" w:w="2268"/>
+            <w:shd w:val="clear" w:color="auto" w:fill="EBF5FB"/>
+          </w:tcPr>
+          <w:p>
+            <w:r>
+              <w:rPr>
+                <w:sz w:val="32"/>
+              </w:rPr>
+              <w:t>เว็บไซต์ออนไลน์พร้อม Demo</w:t>
+            </w:r>
+          </w:p>
+        </w:tc>
+      </w:tr>
+    </w:tbl>
+    <w:p/>
+    <w:p>
+      <w:r>
+        <w:rPr>
+          <w:b/>
+          <w:color w:val="1A56DB"/>
+          <w:sz w:val="34"/>
+        </w:rPr>
+        <w:t>สรุปสิ่งที่ได้ใน 1 วัน</w:t>
       </w:r>
     </w:p>
     <w:p>
       <w:pPr>
-        <w:pStyle w:val="Heading2"/>
+        <w:pStyle w:val="ListBullet"/>
+        <w:ind w:left="283"/>
       </w:pPr>
       <w:r>
         <w:rPr>
-          <w:b/>
-          <w:color w:val="1A56DB"/>
-          <w:sz w:val="30"/>
+          <w:sz w:val="34"/>
         </w:rPr>
-        <w:t>ระยะที่ 1 — เวอร์ชันแรก (สำหรับนำเสนอ)</w:t>
+        <w:t>หน้าแรก + เกี่ยวกับเรา — นำเสนอบริษัทได้ครบถ้วน</w:t>
       </w:r>
     </w:p>
     <w:p>
       <w:pPr>
-        <w:pStyle w:val="ListNumber"/>
+        <w:pStyle w:val="ListBullet"/>
         <w:ind w:left="283"/>
       </w:pPr>
       <w:r>
         <w:rPr>
-          <w:sz w:val="26"/>
+          <w:sz w:val="34"/>
         </w:rPr>
-        <w:t>หน้าแรก — แนะนำบริษัท จุดเด่น และปุ่มขอใบเสนอราคา</w:t>
+        <w:t>แคตาล็อกสินค้า 3 รายการ — พร้อมรูปภาพและสเปคจริง</w:t>
       </w:r>
     </w:p>
     <w:p>
       <w:pPr>
-        <w:pStyle w:val="ListNumber"/>
+        <w:pStyle w:val="ListBullet"/>
         <w:ind w:left="283"/>
       </w:pPr>
       <w:r>
         <w:rPr>
-          <w:sz w:val="26"/>
+          <w:sz w:val="34"/>
         </w:rPr>
-        <w:t>เกี่ยวกับเรา — ประวัติบริษัท 30 ปี ใบรับรอง มอก.</w:t>
+        <w:t>ฟอร์มขอใบเสนอราคา — รับคำขอจากลูกค้าได้จริง</w:t>
       </w:r>
     </w:p>
     <w:p>
       <w:pPr>
-        <w:pStyle w:val="ListNumber"/>
+        <w:pStyle w:val="ListBullet"/>
         <w:ind w:left="283"/>
       </w:pPr>
       <w:r>
         <w:rPr>
-          <w:sz w:val="26"/>
+          <w:sz w:val="34"/>
         </w:rPr>
-        <w:t>แคตาล็อกสินค้า — 3 รายการ พร้อมสเปค รูปภาพจริง และดาวน์โหลดใบสเปค</w:t>
+        <w:t>แจ้งเตือนอีเมล — ผู้ดูแลระบบได้รับแจ้งทันที</w:t>
       </w:r>
     </w:p>
     <w:p>
       <w:pPr>
-        <w:pStyle w:val="ListNumber"/>
+        <w:pStyle w:val="ListBullet"/>
         <w:ind w:left="283"/>
       </w:pPr>
       <w:r>
         <w:rPr>
-          <w:sz w:val="26"/>
+          <w:sz w:val="34"/>
         </w:rPr>
-        <w:t>แบบฟอร์มขอใบเสนอราคา แยกตามกลุ่มลูกค้า + แจ้งเตือนอีเมล</w:t>
+        <w:t>เว็บไซต์ออนไลน์ — มีลิงก์จริงสำหรับ Demo หรือ Pitch</w:t>
+      </w:r>
+    </w:p>
+    <w:p/>
+    <w:p>
+      <w:r>
+        <w:rPr>
+          <w:b/>
+          <w:color w:val="C0392B"/>
+          <w:sz w:val="34"/>
+        </w:rPr>
+        <w:t>สิ่งที่ยังไม่มีใน MVP 1 วัน (ทำต่อในระยะที่ 2–3)</w:t>
       </w:r>
     </w:p>
     <w:p>
       <w:pPr>
-        <w:pStyle w:val="ListNumber"/>
+        <w:pStyle w:val="ListBullet"/>
         <w:ind w:left="283"/>
       </w:pPr>
       <w:r>
         <w:rPr>
-          <w:sz w:val="26"/>
+          <w:sz w:val="34"/>
         </w:rPr>
-        <w:t>รองรับสองภาษา ไทย และ อังกฤษ ทุกหน้า</w:t>
-      </w:r>
-    </w:p>
-    <w:p/>
-    <w:p>
-      <w:pPr>
-        <w:pStyle w:val="Heading2"/>
-      </w:pPr>
-      <w:r>
-        <w:rPr>
-          <w:b/>
-          <w:color w:val="1A56DB"/>
-          <w:sz w:val="30"/>
-        </w:rPr>
-        <w:t>ระยะที่ 2 — ระบบขาย</w:t>
+        <w:t>หน้าจัดการสำหรับผู้ดูแลระบบ (Admin Dashboard)</w:t>
       </w:r>
     </w:p>
     <w:p>
       <w:pPr>
-        <w:pStyle w:val="ListNumber"/>
+        <w:pStyle w:val="ListBullet"/>
         <w:ind w:left="283"/>
       </w:pPr>
       <w:r>
         <w:rPr>
-          <w:sz w:val="26"/>
+          <w:sz w:val="34"/>
         </w:rPr>
-        <w:t>หน้าจัดการสำหรับผู้ดูแล — ดูและจัดการคำขอใบเสนอราคา</w:t>
+        <w:t>รองรับสองภาษา ไทย-อังกฤษ</w:t>
       </w:r>
     </w:p>
     <w:p>
       <w:pPr>
-        <w:pStyle w:val="ListNumber"/>
+        <w:pStyle w:val="ListBullet"/>
         <w:ind w:left="283"/>
       </w:pPr>
       <w:r>
         <w:rPr>
-          <w:sz w:val="26"/>
-        </w:rPr>
-        <w:t>จัดการข้อมูลสินค้าผ่านหน้าแอดมิน</w:t>
-      </w:r>
-    </w:p>
-    <w:p>
-      <w:pPr>
-        <w:pStyle w:val="ListNumber"/>
-        <w:ind w:left="283"/>
-      </w:pPr>
-      <w:r>
-        <w:rPr>
-          <w:sz w:val="26"/>
-        </w:rPr>
-        <w:t>ลูกค้าติดตามสถานะคำขอด้วยรหัสอ้างอิง</w:t>
-      </w:r>
-    </w:p>
-    <w:p>
-      <w:pPr>
-        <w:pStyle w:val="ListNumber"/>
-        <w:ind w:left="283"/>
-      </w:pPr>
-      <w:r>
-        <w:rPr>
-          <w:sz w:val="26"/>
+          <w:sz w:val="34"/>
         </w:rPr>
         <w:t>หน้าผลงานอ้างอิง (Portfolio)</w:t>
       </w:r>
     </w:p>
     <w:p>
       <w:pPr>
-        <w:pStyle w:val="ListNumber"/>
+        <w:pStyle w:val="ListBullet"/>
         <w:ind w:left="283"/>
       </w:pPr>
       <w:r>
         <w:rPr>
-          <w:sz w:val="26"/>
+          <w:sz w:val="34"/>
         </w:rPr>
-        <w:t>ส่งออกรายงานเป็นไฟล์ Excel</w:t>
-      </w:r>
-    </w:p>
-    <w:p/>
-    <w:p>
-      <w:pPr>
-        <w:pStyle w:val="Heading2"/>
-      </w:pPr>
-      <w:r>
-        <w:rPr>
-          <w:b/>
-          <w:color w:val="1A56DB"/>
-          <w:sz w:val="30"/>
-        </w:rPr>
-        <w:t>ระยะที่ 3 — พื้นที่สำหรับลูกค้า (เพิ่มเติม)</w:t>
-      </w:r>
-    </w:p>
-    <w:p>
-      <w:pPr>
-        <w:pStyle w:val="ListNumber"/>
-        <w:ind w:left="283"/>
-      </w:pPr>
-      <w:r>
-        <w:rPr>
-          <w:sz w:val="26"/>
-        </w:rPr>
-        <w:t>ระบบเข้าสู่ระบบสำหรับลูกค้าเอกชน</w:t>
-      </w:r>
-    </w:p>
-    <w:p>
-      <w:pPr>
-        <w:pStyle w:val="ListNumber"/>
-        <w:ind w:left="283"/>
-      </w:pPr>
-      <w:r>
-        <w:rPr>
-          <w:sz w:val="26"/>
-        </w:rPr>
-        <w:t>ประวัติการขอใบเสนอราคาและคำสั่งซื้อ</w:t>
-      </w:r>
-    </w:p>
-    <w:p>
-      <w:pPr>
-        <w:pStyle w:val="ListNumber"/>
-        <w:ind w:left="283"/>
-      </w:pPr>
-      <w:r>
-        <w:rPr>
-          <w:sz w:val="26"/>
-        </w:rPr>
-        <w:t>เอกสารประกอบการจัดซื้อจัดจ้างสำหรับลูกค้าภาครัฐ</w:t>
+        <w:t>ระบบสมาชิกสำหรับลูกค้า</w:t>
       </w:r>
     </w:p>
     <w:p/>
@@ -3088,9 +4346,9 @@
         <w:rPr>
           <w:b/>
           <w:color w:val="1A56DB"/>
-          <w:sz w:val="36"/>
+          <w:sz w:val="44"/>
         </w:rPr>
-        <w:t>7. ระดับความสำคัญของฟีเจอร์</w:t>
+        <w:t>8. ระดับความสำคัญของฟีเจอร์</w:t>
       </w:r>
     </w:p>
     <w:tbl>
@@ -3117,7 +4375,7 @@
               <w:rPr>
                 <w:b/>
                 <w:color w:val="FFFFFF"/>
-                <w:sz w:val="24"/>
+                <w:sz w:val="32"/>
               </w:rPr>
               <w:t>ระดับ</w:t>
             </w:r>
@@ -3136,7 +4394,7 @@
               <w:rPr>
                 <w:b/>
                 <w:color w:val="FFFFFF"/>
-                <w:sz w:val="24"/>
+                <w:sz w:val="32"/>
               </w:rPr>
               <w:t>ความหมาย</w:t>
             </w:r>
@@ -3151,7 +4409,7 @@
           <w:p>
             <w:r>
               <w:rPr>
-                <w:sz w:val="24"/>
+                <w:sz w:val="32"/>
               </w:rPr>
               <w:t>ต้องมี</w:t>
             </w:r>
@@ -3164,7 +4422,7 @@
           <w:p>
             <w:r>
               <w:rPr>
-                <w:sz w:val="24"/>
+                <w:sz w:val="32"/>
               </w:rPr>
               <w:t>ฟีเจอร์หลัก ขาดไม่ได้ ต้องเสร็จในระยะที่ 1</w:t>
             </w:r>
@@ -3180,7 +4438,7 @@
           <w:p>
             <w:r>
               <w:rPr>
-                <w:sz w:val="24"/>
+                <w:sz w:val="32"/>
               </w:rPr>
               <w:t>ควรมี</w:t>
             </w:r>
@@ -3194,7 +4452,7 @@
           <w:p>
             <w:r>
               <w:rPr>
-                <w:sz w:val="24"/>
+                <w:sz w:val="32"/>
               </w:rPr>
               <w:t>เพิ่มคุณค่า ทำในระยะที่ 2</w:t>
             </w:r>
@@ -3209,7 +4467,7 @@
           <w:p>
             <w:r>
               <w:rPr>
-                <w:sz w:val="24"/>
+                <w:sz w:val="32"/>
               </w:rPr>
               <w:t>มีถ้าเวลาเหลือ</w:t>
             </w:r>
@@ -3222,7 +4480,7 @@
           <w:p>
             <w:r>
               <w:rPr>
-                <w:sz w:val="24"/>
+                <w:sz w:val="32"/>
               </w:rPr>
               <w:t>ฟีเจอร์เสริม ทำในระยะที่ 3 หรือหลังจากนั้น</w:t>
             </w:r>
@@ -3232,15 +4490,12 @@
     </w:tbl>
     <w:p/>
     <w:p>
-      <w:pPr>
-        <w:spacing w:before="40" w:after="40"/>
-      </w:pPr>
       <w:r>
         <w:rPr>
           <w:color w:val="CCCCCC"/>
-          <w:sz w:val="16"/>
+          <w:sz w:val="18"/>
         </w:rPr>
-        <w:t>───────────────────────────────────────────────────────────────────────────</w:t>
+        <w:t>─────────────────────────────────────────────────────────────────</w:t>
       </w:r>
     </w:p>
     <w:p>
@@ -3251,7 +4506,7 @@
         <w:rPr>
           <w:i/>
           <w:color w:val="AAAAAA"/>
-          <w:sz w:val="20"/>
+          <w:sz w:val="24"/>
         </w:rPr>
         <w:t>บริษัท สยามมาสเตอร์คอนกรีต จำกัด  |  เอกสารวางแผนเว็บไซต์ WuLab</w:t>
       </w:r>

</xml_diff>